<commit_message>
docs: add Excel template + 3 tax report DOCX files (gift/acquisition/capital gains)
</commit_message>
<xml_diff>
--- a/매매계약서_백송한신_저가매매.docx
+++ b/매매계약서_백송한신_저가매매.docx
@@ -8,6 +8,7 @@
       </w:pPr>
       <w:r>
         <w:rPr>
+          <w:rFonts w:eastAsia="Malgun Gothic" w:ascii="Malgun Gothic" w:hAnsi="Malgun Gothic"/>
           <w:b/>
           <w:color w:val="1A237E"/>
           <w:sz w:val="44"/>
@@ -21,6 +22,7 @@
       </w:pPr>
       <w:r>
         <w:rPr>
+          <w:rFonts w:eastAsia="Malgun Gothic" w:ascii="Malgun Gothic" w:hAnsi="Malgun Gothic"/>
           <w:color w:val="646464"/>
           <w:sz w:val="20"/>
         </w:rPr>
@@ -31,6 +33,7 @@
     <w:p>
       <w:r>
         <w:rPr>
+          <w:rFonts w:eastAsia="Malgun Gothic" w:ascii="Malgun Gothic" w:hAnsi="Malgun Gothic"/>
           <w:b/>
           <w:sz w:val="26"/>
         </w:rPr>
@@ -45,22 +48,26 @@
         <w:tblLook w:firstColumn="1" w:firstRow="1" w:lastColumn="0" w:lastRow="0" w:noHBand="0" w:noVBand="1" w:val="04A0"/>
       </w:tblPr>
       <w:tblGrid>
-        <w:gridCol w:w="2160"/>
-        <w:gridCol w:w="2160"/>
-        <w:gridCol w:w="2160"/>
-        <w:gridCol w:w="2160"/>
+        <w:gridCol w:w="2351"/>
+        <w:gridCol w:w="2351"/>
+        <w:gridCol w:w="2351"/>
+        <w:gridCol w:w="2351"/>
       </w:tblGrid>
       <w:tr>
         <w:tc>
           <w:tcPr>
-            <w:tcW w:type="dxa" w:w="2160"/>
+            <w:tcW w:type="dxa" w:w="2351"/>
+            <w:vAlign w:val="center"/>
+            <w:shd w:fill="E8EAF6"/>
           </w:tcPr>
           <w:p>
             <w:pPr>
               <w:jc w:val="center"/>
             </w:pPr>
+            <w:r/>
             <w:r>
               <w:rPr>
+                <w:rFonts w:eastAsia="Malgun Gothic" w:ascii="Malgun Gothic" w:hAnsi="Malgun Gothic"/>
                 <w:b/>
                 <w:sz w:val="20"/>
               </w:rPr>
@@ -70,32 +77,40 @@
         </w:tc>
         <w:tc>
           <w:tcPr>
-            <w:tcW w:type="dxa" w:w="2160"/>
+            <w:tcW w:type="dxa" w:w="2351"/>
+            <w:vAlign w:val="center"/>
+            <w:shd w:fill="E8EAF6"/>
           </w:tcPr>
           <w:p>
             <w:pPr>
               <w:jc w:val="center"/>
             </w:pPr>
+            <w:r/>
             <w:r>
               <w:rPr>
-                <w:b w:val="0"/>
+                <w:rFonts w:eastAsia="Malgun Gothic" w:ascii="Malgun Gothic" w:hAnsi="Malgun Gothic"/>
+                <w:b/>
                 <w:sz w:val="20"/>
               </w:rPr>
-              <w:t>성 명</w:t>
+              <w:t>성   명</w:t>
             </w:r>
           </w:p>
         </w:tc>
         <w:tc>
           <w:tcPr>
-            <w:tcW w:type="dxa" w:w="2160"/>
+            <w:tcW w:type="dxa" w:w="2351"/>
+            <w:vAlign w:val="center"/>
+            <w:shd w:fill="E8EAF6"/>
           </w:tcPr>
           <w:p>
             <w:pPr>
               <w:jc w:val="center"/>
             </w:pPr>
+            <w:r/>
             <w:r>
               <w:rPr>
-                <w:b w:val="0"/>
+                <w:rFonts w:eastAsia="Malgun Gothic" w:ascii="Malgun Gothic" w:hAnsi="Malgun Gothic"/>
+                <w:b/>
                 <w:sz w:val="20"/>
               </w:rPr>
             </w:r>
@@ -103,15 +118,19 @@
         </w:tc>
         <w:tc>
           <w:tcPr>
-            <w:tcW w:type="dxa" w:w="2160"/>
+            <w:tcW w:type="dxa" w:w="2351"/>
+            <w:vAlign w:val="center"/>
+            <w:shd w:fill="E8EAF6"/>
           </w:tcPr>
           <w:p>
             <w:pPr>
               <w:jc w:val="center"/>
             </w:pPr>
+            <w:r/>
             <w:r>
               <w:rPr>
-                <w:b w:val="0"/>
+                <w:rFonts w:eastAsia="Malgun Gothic" w:ascii="Malgun Gothic" w:hAnsi="Malgun Gothic"/>
+                <w:b/>
                 <w:sz w:val="20"/>
               </w:rPr>
               <w:t>(인)</w:t>
@@ -122,32 +141,36 @@
       <w:tr>
         <w:tc>
           <w:tcPr>
-            <w:tcW w:type="dxa" w:w="2160"/>
+            <w:tcW w:type="dxa" w:w="2351"/>
+            <w:vAlign w:val="center"/>
           </w:tcPr>
           <w:p>
             <w:pPr>
               <w:jc w:val="center"/>
             </w:pPr>
+            <w:r/>
             <w:r>
               <w:rPr>
-                <w:b w:val="0"/>
-                <w:sz w:val="20"/>
+                <w:rFonts w:eastAsia="Malgun Gothic" w:ascii="Malgun Gothic" w:hAnsi="Malgun Gothic"/>
+                <w:sz w:val="18"/>
               </w:rPr>
             </w:r>
           </w:p>
         </w:tc>
         <w:tc>
           <w:tcPr>
-            <w:tcW w:type="dxa" w:w="2160"/>
+            <w:tcW w:type="dxa" w:w="2351"/>
+            <w:vAlign w:val="center"/>
           </w:tcPr>
           <w:p>
             <w:pPr>
               <w:jc w:val="center"/>
             </w:pPr>
+            <w:r/>
             <w:r>
               <w:rPr>
-                <w:b w:val="0"/>
-                <w:sz w:val="20"/>
+                <w:rFonts w:eastAsia="Malgun Gothic" w:ascii="Malgun Gothic" w:hAnsi="Malgun Gothic"/>
+                <w:sz w:val="18"/>
               </w:rPr>
               <w:t>주민등록번호</w:t>
             </w:r>
@@ -155,16 +178,18 @@
         </w:tc>
         <w:tc>
           <w:tcPr>
-            <w:tcW w:type="dxa" w:w="2160"/>
+            <w:tcW w:type="dxa" w:w="2351"/>
+            <w:vAlign w:val="center"/>
           </w:tcPr>
           <w:p>
             <w:pPr>
               <w:jc w:val="center"/>
             </w:pPr>
+            <w:r/>
             <w:r>
               <w:rPr>
-                <w:b w:val="0"/>
-                <w:sz w:val="20"/>
+                <w:rFonts w:eastAsia="Malgun Gothic" w:ascii="Malgun Gothic" w:hAnsi="Malgun Gothic"/>
+                <w:sz w:val="18"/>
               </w:rPr>
               <w:t xml:space="preserve">         -         </w:t>
             </w:r>
@@ -172,16 +197,18 @@
         </w:tc>
         <w:tc>
           <w:tcPr>
-            <w:tcW w:type="dxa" w:w="2160"/>
+            <w:tcW w:type="dxa" w:w="2351"/>
+            <w:vAlign w:val="center"/>
           </w:tcPr>
           <w:p>
             <w:pPr>
               <w:jc w:val="center"/>
             </w:pPr>
+            <w:r/>
             <w:r>
               <w:rPr>
-                <w:b w:val="0"/>
-                <w:sz w:val="20"/>
+                <w:rFonts w:eastAsia="Malgun Gothic" w:ascii="Malgun Gothic" w:hAnsi="Malgun Gothic"/>
+                <w:sz w:val="18"/>
               </w:rPr>
             </w:r>
           </w:p>
@@ -190,50 +217,73 @@
       <w:tr>
         <w:tc>
           <w:tcPr>
-            <w:tcW w:type="dxa" w:w="2160"/>
+            <w:tcW w:type="dxa" w:w="2351"/>
+            <w:vAlign w:val="center"/>
           </w:tcPr>
           <w:p>
             <w:pPr>
               <w:jc w:val="center"/>
             </w:pPr>
+            <w:r/>
             <w:r>
               <w:rPr>
-                <w:b w:val="0"/>
-                <w:sz w:val="20"/>
+                <w:rFonts w:eastAsia="Malgun Gothic" w:ascii="Malgun Gothic" w:hAnsi="Malgun Gothic"/>
+                <w:sz w:val="18"/>
               </w:rPr>
             </w:r>
           </w:p>
         </w:tc>
         <w:tc>
           <w:tcPr>
-            <w:tcW w:type="dxa" w:w="2160"/>
+            <w:tcW w:type="dxa" w:w="2351"/>
+            <w:vAlign w:val="center"/>
           </w:tcPr>
           <w:p>
             <w:pPr>
               <w:jc w:val="center"/>
             </w:pPr>
+            <w:r/>
             <w:r>
               <w:rPr>
-                <w:b w:val="0"/>
-                <w:sz w:val="20"/>
+                <w:rFonts w:eastAsia="Malgun Gothic" w:ascii="Malgun Gothic" w:hAnsi="Malgun Gothic"/>
+                <w:sz w:val="18"/>
               </w:rPr>
-              <w:t>주 소</w:t>
+              <w:t>주   소</w:t>
             </w:r>
           </w:p>
         </w:tc>
         <w:tc>
           <w:tcPr>
-            <w:tcW w:type="dxa" w:w="4320"/>
-            <w:gridSpan w:val="2"/>
+            <w:tcW w:type="dxa" w:w="2351"/>
+            <w:vAlign w:val="center"/>
           </w:tcPr>
           <w:p>
             <w:pPr>
               <w:jc w:val="center"/>
             </w:pPr>
+            <w:r/>
             <w:r>
               <w:rPr>
-                <w:b w:val="0"/>
-                <w:sz w:val="20"/>
+                <w:rFonts w:eastAsia="Malgun Gothic" w:ascii="Malgun Gothic" w:hAnsi="Malgun Gothic"/>
+                <w:sz w:val="18"/>
+              </w:rPr>
+            </w:r>
+          </w:p>
+        </w:tc>
+        <w:tc>
+          <w:tcPr>
+            <w:tcW w:type="dxa" w:w="2351"/>
+            <w:vAlign w:val="center"/>
+          </w:tcPr>
+          <w:p>
+            <w:pPr>
+              <w:jc w:val="center"/>
+            </w:pPr>
+            <w:r/>
+            <w:r>
+              <w:rPr>
+                <w:rFonts w:eastAsia="Malgun Gothic" w:ascii="Malgun Gothic" w:hAnsi="Malgun Gothic"/>
+                <w:sz w:val="18"/>
               </w:rPr>
             </w:r>
           </w:p>
@@ -242,65 +292,73 @@
       <w:tr>
         <w:tc>
           <w:tcPr>
-            <w:tcW w:type="dxa" w:w="2160"/>
+            <w:tcW w:type="dxa" w:w="2351"/>
+            <w:vAlign w:val="center"/>
           </w:tcPr>
           <w:p>
             <w:pPr>
               <w:jc w:val="center"/>
             </w:pPr>
+            <w:r/>
             <w:r>
               <w:rPr>
-                <w:b w:val="0"/>
-                <w:sz w:val="20"/>
+                <w:rFonts w:eastAsia="Malgun Gothic" w:ascii="Malgun Gothic" w:hAnsi="Malgun Gothic"/>
+                <w:sz w:val="18"/>
               </w:rPr>
             </w:r>
           </w:p>
         </w:tc>
         <w:tc>
           <w:tcPr>
-            <w:tcW w:type="dxa" w:w="2160"/>
+            <w:tcW w:type="dxa" w:w="2351"/>
+            <w:vAlign w:val="center"/>
           </w:tcPr>
           <w:p>
             <w:pPr>
               <w:jc w:val="center"/>
             </w:pPr>
+            <w:r/>
             <w:r>
               <w:rPr>
-                <w:b w:val="0"/>
-                <w:sz w:val="20"/>
+                <w:rFonts w:eastAsia="Malgun Gothic" w:ascii="Malgun Gothic" w:hAnsi="Malgun Gothic"/>
+                <w:sz w:val="18"/>
               </w:rPr>
-              <w:t>연락처</w:t>
+              <w:t>연 락 처</w:t>
             </w:r>
           </w:p>
         </w:tc>
         <w:tc>
           <w:tcPr>
-            <w:tcW w:type="dxa" w:w="2160"/>
+            <w:tcW w:type="dxa" w:w="2351"/>
+            <w:vAlign w:val="center"/>
           </w:tcPr>
           <w:p>
             <w:pPr>
               <w:jc w:val="center"/>
             </w:pPr>
+            <w:r/>
             <w:r>
               <w:rPr>
-                <w:b w:val="0"/>
-                <w:sz w:val="20"/>
+                <w:rFonts w:eastAsia="Malgun Gothic" w:ascii="Malgun Gothic" w:hAnsi="Malgun Gothic"/>
+                <w:sz w:val="18"/>
               </w:rPr>
             </w:r>
           </w:p>
         </w:tc>
         <w:tc>
           <w:tcPr>
-            <w:tcW w:type="dxa" w:w="2160"/>
+            <w:tcW w:type="dxa" w:w="2351"/>
+            <w:vAlign w:val="center"/>
           </w:tcPr>
           <w:p>
             <w:pPr>
               <w:jc w:val="center"/>
             </w:pPr>
+            <w:r/>
             <w:r>
               <w:rPr>
-                <w:b w:val="0"/>
-                <w:sz w:val="20"/>
+                <w:rFonts w:eastAsia="Malgun Gothic" w:ascii="Malgun Gothic" w:hAnsi="Malgun Gothic"/>
+                <w:sz w:val="18"/>
               </w:rPr>
             </w:r>
           </w:p>
@@ -316,22 +374,26 @@
         <w:tblLook w:firstColumn="1" w:firstRow="1" w:lastColumn="0" w:lastRow="0" w:noHBand="0" w:noVBand="1" w:val="04A0"/>
       </w:tblPr>
       <w:tblGrid>
-        <w:gridCol w:w="2160"/>
-        <w:gridCol w:w="2160"/>
-        <w:gridCol w:w="2160"/>
-        <w:gridCol w:w="2160"/>
+        <w:gridCol w:w="2351"/>
+        <w:gridCol w:w="2351"/>
+        <w:gridCol w:w="2351"/>
+        <w:gridCol w:w="2351"/>
       </w:tblGrid>
       <w:tr>
         <w:tc>
           <w:tcPr>
-            <w:tcW w:type="dxa" w:w="2160"/>
+            <w:tcW w:type="dxa" w:w="2351"/>
+            <w:vAlign w:val="center"/>
+            <w:shd w:fill="E8EAF6"/>
           </w:tcPr>
           <w:p>
             <w:pPr>
               <w:jc w:val="center"/>
             </w:pPr>
+            <w:r/>
             <w:r>
               <w:rPr>
+                <w:rFonts w:eastAsia="Malgun Gothic" w:ascii="Malgun Gothic" w:hAnsi="Malgun Gothic"/>
                 <w:b/>
                 <w:sz w:val="20"/>
               </w:rPr>
@@ -341,32 +403,40 @@
         </w:tc>
         <w:tc>
           <w:tcPr>
-            <w:tcW w:type="dxa" w:w="2160"/>
+            <w:tcW w:type="dxa" w:w="2351"/>
+            <w:vAlign w:val="center"/>
+            <w:shd w:fill="E8EAF6"/>
           </w:tcPr>
           <w:p>
             <w:pPr>
               <w:jc w:val="center"/>
             </w:pPr>
+            <w:r/>
             <w:r>
               <w:rPr>
-                <w:b w:val="0"/>
+                <w:rFonts w:eastAsia="Malgun Gothic" w:ascii="Malgun Gothic" w:hAnsi="Malgun Gothic"/>
+                <w:b/>
                 <w:sz w:val="20"/>
               </w:rPr>
-              <w:t>성 명</w:t>
+              <w:t>성   명</w:t>
             </w:r>
           </w:p>
         </w:tc>
         <w:tc>
           <w:tcPr>
-            <w:tcW w:type="dxa" w:w="2160"/>
+            <w:tcW w:type="dxa" w:w="2351"/>
+            <w:vAlign w:val="center"/>
+            <w:shd w:fill="E8EAF6"/>
           </w:tcPr>
           <w:p>
             <w:pPr>
               <w:jc w:val="center"/>
             </w:pPr>
+            <w:r/>
             <w:r>
               <w:rPr>
-                <w:b w:val="0"/>
+                <w:rFonts w:eastAsia="Malgun Gothic" w:ascii="Malgun Gothic" w:hAnsi="Malgun Gothic"/>
+                <w:b/>
                 <w:sz w:val="20"/>
               </w:rPr>
             </w:r>
@@ -374,15 +444,19 @@
         </w:tc>
         <w:tc>
           <w:tcPr>
-            <w:tcW w:type="dxa" w:w="2160"/>
+            <w:tcW w:type="dxa" w:w="2351"/>
+            <w:vAlign w:val="center"/>
+            <w:shd w:fill="E8EAF6"/>
           </w:tcPr>
           <w:p>
             <w:pPr>
               <w:jc w:val="center"/>
             </w:pPr>
+            <w:r/>
             <w:r>
               <w:rPr>
-                <w:b w:val="0"/>
+                <w:rFonts w:eastAsia="Malgun Gothic" w:ascii="Malgun Gothic" w:hAnsi="Malgun Gothic"/>
+                <w:b/>
                 <w:sz w:val="20"/>
               </w:rPr>
               <w:t>(인)</w:t>
@@ -393,32 +467,36 @@
       <w:tr>
         <w:tc>
           <w:tcPr>
-            <w:tcW w:type="dxa" w:w="2160"/>
+            <w:tcW w:type="dxa" w:w="2351"/>
+            <w:vAlign w:val="center"/>
           </w:tcPr>
           <w:p>
             <w:pPr>
               <w:jc w:val="center"/>
             </w:pPr>
+            <w:r/>
             <w:r>
               <w:rPr>
-                <w:b w:val="0"/>
-                <w:sz w:val="20"/>
+                <w:rFonts w:eastAsia="Malgun Gothic" w:ascii="Malgun Gothic" w:hAnsi="Malgun Gothic"/>
+                <w:sz w:val="18"/>
               </w:rPr>
             </w:r>
           </w:p>
         </w:tc>
         <w:tc>
           <w:tcPr>
-            <w:tcW w:type="dxa" w:w="2160"/>
+            <w:tcW w:type="dxa" w:w="2351"/>
+            <w:vAlign w:val="center"/>
           </w:tcPr>
           <w:p>
             <w:pPr>
               <w:jc w:val="center"/>
             </w:pPr>
+            <w:r/>
             <w:r>
               <w:rPr>
-                <w:b w:val="0"/>
-                <w:sz w:val="20"/>
+                <w:rFonts w:eastAsia="Malgun Gothic" w:ascii="Malgun Gothic" w:hAnsi="Malgun Gothic"/>
+                <w:sz w:val="18"/>
               </w:rPr>
               <w:t>주민등록번호</w:t>
             </w:r>
@@ -426,16 +504,18 @@
         </w:tc>
         <w:tc>
           <w:tcPr>
-            <w:tcW w:type="dxa" w:w="2160"/>
+            <w:tcW w:type="dxa" w:w="2351"/>
+            <w:vAlign w:val="center"/>
           </w:tcPr>
           <w:p>
             <w:pPr>
               <w:jc w:val="center"/>
             </w:pPr>
+            <w:r/>
             <w:r>
               <w:rPr>
-                <w:b w:val="0"/>
-                <w:sz w:val="20"/>
+                <w:rFonts w:eastAsia="Malgun Gothic" w:ascii="Malgun Gothic" w:hAnsi="Malgun Gothic"/>
+                <w:sz w:val="18"/>
               </w:rPr>
               <w:t xml:space="preserve">         -         </w:t>
             </w:r>
@@ -443,16 +523,18 @@
         </w:tc>
         <w:tc>
           <w:tcPr>
-            <w:tcW w:type="dxa" w:w="2160"/>
+            <w:tcW w:type="dxa" w:w="2351"/>
+            <w:vAlign w:val="center"/>
           </w:tcPr>
           <w:p>
             <w:pPr>
               <w:jc w:val="center"/>
             </w:pPr>
+            <w:r/>
             <w:r>
               <w:rPr>
-                <w:b w:val="0"/>
-                <w:sz w:val="20"/>
+                <w:rFonts w:eastAsia="Malgun Gothic" w:ascii="Malgun Gothic" w:hAnsi="Malgun Gothic"/>
+                <w:sz w:val="18"/>
               </w:rPr>
             </w:r>
           </w:p>
@@ -461,50 +543,73 @@
       <w:tr>
         <w:tc>
           <w:tcPr>
-            <w:tcW w:type="dxa" w:w="2160"/>
+            <w:tcW w:type="dxa" w:w="2351"/>
+            <w:vAlign w:val="center"/>
           </w:tcPr>
           <w:p>
             <w:pPr>
               <w:jc w:val="center"/>
             </w:pPr>
+            <w:r/>
             <w:r>
               <w:rPr>
-                <w:b w:val="0"/>
-                <w:sz w:val="20"/>
+                <w:rFonts w:eastAsia="Malgun Gothic" w:ascii="Malgun Gothic" w:hAnsi="Malgun Gothic"/>
+                <w:sz w:val="18"/>
               </w:rPr>
             </w:r>
           </w:p>
         </w:tc>
         <w:tc>
           <w:tcPr>
-            <w:tcW w:type="dxa" w:w="2160"/>
+            <w:tcW w:type="dxa" w:w="2351"/>
+            <w:vAlign w:val="center"/>
           </w:tcPr>
           <w:p>
             <w:pPr>
               <w:jc w:val="center"/>
             </w:pPr>
+            <w:r/>
             <w:r>
               <w:rPr>
-                <w:b w:val="0"/>
-                <w:sz w:val="20"/>
+                <w:rFonts w:eastAsia="Malgun Gothic" w:ascii="Malgun Gothic" w:hAnsi="Malgun Gothic"/>
+                <w:sz w:val="18"/>
               </w:rPr>
-              <w:t>주 소</w:t>
+              <w:t>주   소</w:t>
             </w:r>
           </w:p>
         </w:tc>
         <w:tc>
           <w:tcPr>
-            <w:tcW w:type="dxa" w:w="4320"/>
-            <w:gridSpan w:val="2"/>
+            <w:tcW w:type="dxa" w:w="2351"/>
+            <w:vAlign w:val="center"/>
           </w:tcPr>
           <w:p>
             <w:pPr>
               <w:jc w:val="center"/>
             </w:pPr>
+            <w:r/>
             <w:r>
               <w:rPr>
-                <w:b w:val="0"/>
-                <w:sz w:val="20"/>
+                <w:rFonts w:eastAsia="Malgun Gothic" w:ascii="Malgun Gothic" w:hAnsi="Malgun Gothic"/>
+                <w:sz w:val="18"/>
+              </w:rPr>
+            </w:r>
+          </w:p>
+        </w:tc>
+        <w:tc>
+          <w:tcPr>
+            <w:tcW w:type="dxa" w:w="2351"/>
+            <w:vAlign w:val="center"/>
+          </w:tcPr>
+          <w:p>
+            <w:pPr>
+              <w:jc w:val="center"/>
+            </w:pPr>
+            <w:r/>
+            <w:r>
+              <w:rPr>
+                <w:rFonts w:eastAsia="Malgun Gothic" w:ascii="Malgun Gothic" w:hAnsi="Malgun Gothic"/>
+                <w:sz w:val="18"/>
               </w:rPr>
             </w:r>
           </w:p>
@@ -513,65 +618,73 @@
       <w:tr>
         <w:tc>
           <w:tcPr>
-            <w:tcW w:type="dxa" w:w="2160"/>
+            <w:tcW w:type="dxa" w:w="2351"/>
+            <w:vAlign w:val="center"/>
           </w:tcPr>
           <w:p>
             <w:pPr>
               <w:jc w:val="center"/>
             </w:pPr>
+            <w:r/>
             <w:r>
               <w:rPr>
-                <w:b w:val="0"/>
-                <w:sz w:val="20"/>
+                <w:rFonts w:eastAsia="Malgun Gothic" w:ascii="Malgun Gothic" w:hAnsi="Malgun Gothic"/>
+                <w:sz w:val="18"/>
               </w:rPr>
             </w:r>
           </w:p>
         </w:tc>
         <w:tc>
           <w:tcPr>
-            <w:tcW w:type="dxa" w:w="2160"/>
+            <w:tcW w:type="dxa" w:w="2351"/>
+            <w:vAlign w:val="center"/>
           </w:tcPr>
           <w:p>
             <w:pPr>
               <w:jc w:val="center"/>
             </w:pPr>
+            <w:r/>
             <w:r>
               <w:rPr>
-                <w:b w:val="0"/>
-                <w:sz w:val="20"/>
+                <w:rFonts w:eastAsia="Malgun Gothic" w:ascii="Malgun Gothic" w:hAnsi="Malgun Gothic"/>
+                <w:sz w:val="18"/>
               </w:rPr>
-              <w:t>연락처</w:t>
+              <w:t>연 락 처</w:t>
             </w:r>
           </w:p>
         </w:tc>
         <w:tc>
           <w:tcPr>
-            <w:tcW w:type="dxa" w:w="2160"/>
+            <w:tcW w:type="dxa" w:w="2351"/>
+            <w:vAlign w:val="center"/>
           </w:tcPr>
           <w:p>
             <w:pPr>
               <w:jc w:val="center"/>
             </w:pPr>
+            <w:r/>
             <w:r>
               <w:rPr>
-                <w:b w:val="0"/>
-                <w:sz w:val="20"/>
+                <w:rFonts w:eastAsia="Malgun Gothic" w:ascii="Malgun Gothic" w:hAnsi="Malgun Gothic"/>
+                <w:sz w:val="18"/>
               </w:rPr>
             </w:r>
           </w:p>
         </w:tc>
         <w:tc>
           <w:tcPr>
-            <w:tcW w:type="dxa" w:w="2160"/>
+            <w:tcW w:type="dxa" w:w="2351"/>
+            <w:vAlign w:val="center"/>
           </w:tcPr>
           <w:p>
             <w:pPr>
               <w:jc w:val="center"/>
             </w:pPr>
+            <w:r/>
             <w:r>
               <w:rPr>
-                <w:b w:val="0"/>
-                <w:sz w:val="20"/>
+                <w:rFonts w:eastAsia="Malgun Gothic" w:ascii="Malgun Gothic" w:hAnsi="Malgun Gothic"/>
+                <w:sz w:val="18"/>
               </w:rPr>
             </w:r>
           </w:p>
@@ -584,6 +697,11 @@
         <w:jc w:val="center"/>
       </w:pPr>
       <w:r>
+        <w:rPr>
+          <w:rFonts w:eastAsia="Malgun Gothic" w:ascii="Malgun Gothic" w:hAnsi="Malgun Gothic"/>
+          <w:b w:val="0"/>
+          <w:sz w:val="22"/>
+        </w:rPr>
         <w:t>갑과 을은 아래 부동산에 관하여 다음과 같이 매매계약을 체결한다.</w:t>
       </w:r>
     </w:p>
@@ -591,6 +709,7 @@
     <w:p>
       <w:r>
         <w:rPr>
+          <w:rFonts w:eastAsia="Malgun Gothic" w:ascii="Malgun Gothic" w:hAnsi="Malgun Gothic"/>
           <w:b/>
           <w:sz w:val="26"/>
         </w:rPr>
@@ -605,22 +724,68 @@
         <w:tblLook w:firstColumn="1" w:firstRow="1" w:lastColumn="0" w:lastRow="0" w:noHBand="0" w:noVBand="1" w:val="04A0"/>
       </w:tblPr>
       <w:tblGrid>
-        <w:gridCol w:w="4320"/>
-        <w:gridCol w:w="4320"/>
+        <w:gridCol w:w="4703"/>
+        <w:gridCol w:w="4703"/>
       </w:tblGrid>
       <w:tr>
         <w:tc>
           <w:tcPr>
-            <w:tcW w:type="dxa" w:w="4320"/>
+            <w:tcW w:type="dxa" w:w="4703"/>
+            <w:vAlign w:val="center"/>
+            <w:shd w:fill="E8EAF6"/>
           </w:tcPr>
           <w:p>
             <w:pPr>
               <w:jc w:val="center"/>
             </w:pPr>
+            <w:r/>
             <w:r>
               <w:rPr>
+                <w:rFonts w:eastAsia="Malgun Gothic" w:ascii="Malgun Gothic" w:hAnsi="Malgun Gothic"/>
                 <w:b/>
                 <w:sz w:val="20"/>
+              </w:rPr>
+              <w:t>항 목</w:t>
+            </w:r>
+          </w:p>
+        </w:tc>
+        <w:tc>
+          <w:tcPr>
+            <w:tcW w:type="dxa" w:w="4703"/>
+            <w:vAlign w:val="center"/>
+            <w:shd w:fill="E8EAF6"/>
+          </w:tcPr>
+          <w:p>
+            <w:pPr>
+              <w:jc w:val="center"/>
+            </w:pPr>
+            <w:r/>
+            <w:r>
+              <w:rPr>
+                <w:rFonts w:eastAsia="Malgun Gothic" w:ascii="Malgun Gothic" w:hAnsi="Malgun Gothic"/>
+                <w:b/>
+                <w:sz w:val="20"/>
+              </w:rPr>
+              <w:t>내 용</w:t>
+            </w:r>
+          </w:p>
+        </w:tc>
+      </w:tr>
+      <w:tr>
+        <w:tc>
+          <w:tcPr>
+            <w:tcW w:type="dxa" w:w="4703"/>
+            <w:vAlign w:val="center"/>
+          </w:tcPr>
+          <w:p>
+            <w:pPr>
+              <w:jc w:val="center"/>
+            </w:pPr>
+            <w:r/>
+            <w:r>
+              <w:rPr>
+                <w:rFonts w:eastAsia="Malgun Gothic" w:ascii="Malgun Gothic" w:hAnsi="Malgun Gothic"/>
+                <w:sz w:val="18"/>
               </w:rPr>
               <w:t>소 재 지</w:t>
             </w:r>
@@ -628,18 +793,20 @@
         </w:tc>
         <w:tc>
           <w:tcPr>
-            <w:tcW w:type="dxa" w:w="4320"/>
+            <w:tcW w:type="dxa" w:w="4703"/>
+            <w:vAlign w:val="center"/>
           </w:tcPr>
           <w:p>
             <w:pPr>
               <w:jc w:val="center"/>
             </w:pPr>
+            <w:r/>
             <w:r>
               <w:rPr>
-                <w:b w:val="0"/>
-                <w:sz w:val="20"/>
+                <w:rFonts w:eastAsia="Malgun Gothic" w:ascii="Malgun Gothic" w:hAnsi="Malgun Gothic"/>
+                <w:sz w:val="18"/>
               </w:rPr>
-              <w:t xml:space="preserve">경기도 고양시 일산서구                                    </w:t>
+              <w:t>경기도 고양시 일산서구</w:t>
             </w:r>
           </w:p>
         </w:tc>
@@ -647,16 +814,18 @@
       <w:tr>
         <w:tc>
           <w:tcPr>
-            <w:tcW w:type="dxa" w:w="4320"/>
+            <w:tcW w:type="dxa" w:w="4703"/>
+            <w:vAlign w:val="center"/>
           </w:tcPr>
           <w:p>
             <w:pPr>
               <w:jc w:val="center"/>
             </w:pPr>
+            <w:r/>
             <w:r>
               <w:rPr>
-                <w:b/>
-                <w:sz w:val="20"/>
+                <w:rFonts w:eastAsia="Malgun Gothic" w:ascii="Malgun Gothic" w:hAnsi="Malgun Gothic"/>
+                <w:sz w:val="18"/>
               </w:rPr>
               <w:t>단 지 명</w:t>
             </w:r>
@@ -664,18 +833,20 @@
         </w:tc>
         <w:tc>
           <w:tcPr>
-            <w:tcW w:type="dxa" w:w="4320"/>
+            <w:tcW w:type="dxa" w:w="4703"/>
+            <w:vAlign w:val="center"/>
           </w:tcPr>
           <w:p>
             <w:pPr>
               <w:jc w:val="center"/>
             </w:pPr>
+            <w:r/>
             <w:r>
               <w:rPr>
-                <w:b w:val="0"/>
-                <w:sz w:val="20"/>
+                <w:rFonts w:eastAsia="Malgun Gothic" w:ascii="Malgun Gothic" w:hAnsi="Malgun Gothic"/>
+                <w:sz w:val="18"/>
               </w:rPr>
-              <w:t>백송한신아파트          동          호</w:t>
+              <w:t>백송한신아파트       동       호</w:t>
             </w:r>
           </w:p>
         </w:tc>
@@ -683,16 +854,18 @@
       <w:tr>
         <w:tc>
           <w:tcPr>
-            <w:tcW w:type="dxa" w:w="4320"/>
+            <w:tcW w:type="dxa" w:w="4703"/>
+            <w:vAlign w:val="center"/>
           </w:tcPr>
           <w:p>
             <w:pPr>
               <w:jc w:val="center"/>
             </w:pPr>
+            <w:r/>
             <w:r>
               <w:rPr>
-                <w:b/>
-                <w:sz w:val="20"/>
+                <w:rFonts w:eastAsia="Malgun Gothic" w:ascii="Malgun Gothic" w:hAnsi="Malgun Gothic"/>
+                <w:sz w:val="18"/>
               </w:rPr>
               <w:t>면    적</w:t>
             </w:r>
@@ -700,18 +873,20 @@
         </w:tc>
         <w:tc>
           <w:tcPr>
-            <w:tcW w:type="dxa" w:w="4320"/>
+            <w:tcW w:type="dxa" w:w="4703"/>
+            <w:vAlign w:val="center"/>
           </w:tcPr>
           <w:p>
             <w:pPr>
               <w:jc w:val="center"/>
             </w:pPr>
+            <w:r/>
             <w:r>
               <w:rPr>
-                <w:b w:val="0"/>
-                <w:sz w:val="20"/>
+                <w:rFonts w:eastAsia="Malgun Gothic" w:ascii="Malgun Gothic" w:hAnsi="Malgun Gothic"/>
+                <w:sz w:val="18"/>
               </w:rPr>
-              <w:t>공급면적 50B㎡  (전용면적 37B㎡)</w:t>
+              <w:t>공급 50B㎡ (전용 37B㎡)</w:t>
             </w:r>
           </w:p>
         </w:tc>
@@ -719,16 +894,18 @@
       <w:tr>
         <w:tc>
           <w:tcPr>
-            <w:tcW w:type="dxa" w:w="4320"/>
+            <w:tcW w:type="dxa" w:w="4703"/>
+            <w:vAlign w:val="center"/>
           </w:tcPr>
           <w:p>
             <w:pPr>
               <w:jc w:val="center"/>
             </w:pPr>
+            <w:r/>
             <w:r>
               <w:rPr>
-                <w:b/>
-                <w:sz w:val="20"/>
+                <w:rFonts w:eastAsia="Malgun Gothic" w:ascii="Malgun Gothic" w:hAnsi="Malgun Gothic"/>
+                <w:sz w:val="18"/>
               </w:rPr>
               <w:t>구    조</w:t>
             </w:r>
@@ -736,16 +913,18 @@
         </w:tc>
         <w:tc>
           <w:tcPr>
-            <w:tcW w:type="dxa" w:w="4320"/>
+            <w:tcW w:type="dxa" w:w="4703"/>
+            <w:vAlign w:val="center"/>
           </w:tcPr>
           <w:p>
             <w:pPr>
               <w:jc w:val="center"/>
             </w:pPr>
+            <w:r/>
             <w:r>
               <w:rPr>
-                <w:b w:val="0"/>
-                <w:sz w:val="20"/>
+                <w:rFonts w:eastAsia="Malgun Gothic" w:ascii="Malgun Gothic" w:hAnsi="Malgun Gothic"/>
+                <w:sz w:val="18"/>
               </w:rPr>
               <w:t>철근콘크리트 / 아파트</w:t>
             </w:r>
@@ -755,16 +934,18 @@
       <w:tr>
         <w:tc>
           <w:tcPr>
-            <w:tcW w:type="dxa" w:w="4320"/>
+            <w:tcW w:type="dxa" w:w="4703"/>
+            <w:vAlign w:val="center"/>
           </w:tcPr>
           <w:p>
             <w:pPr>
               <w:jc w:val="center"/>
             </w:pPr>
+            <w:r/>
             <w:r>
               <w:rPr>
-                <w:b/>
-                <w:sz w:val="20"/>
+                <w:rFonts w:eastAsia="Malgun Gothic" w:ascii="Malgun Gothic" w:hAnsi="Malgun Gothic"/>
+                <w:sz w:val="18"/>
               </w:rPr>
               <w:t>준공년도</w:t>
             </w:r>
@@ -772,16 +953,18 @@
         </w:tc>
         <w:tc>
           <w:tcPr>
-            <w:tcW w:type="dxa" w:w="4320"/>
+            <w:tcW w:type="dxa" w:w="4703"/>
+            <w:vAlign w:val="center"/>
           </w:tcPr>
           <w:p>
             <w:pPr>
               <w:jc w:val="center"/>
             </w:pPr>
+            <w:r/>
             <w:r>
               <w:rPr>
-                <w:b w:val="0"/>
-                <w:sz w:val="20"/>
+                <w:rFonts w:eastAsia="Malgun Gothic" w:ascii="Malgun Gothic" w:hAnsi="Malgun Gothic"/>
+                <w:sz w:val="18"/>
               </w:rPr>
               <w:t>1992년 9월 (34년차)</w:t>
             </w:r>
@@ -793,6 +976,7 @@
     <w:p>
       <w:r>
         <w:rPr>
+          <w:rFonts w:eastAsia="Malgun Gothic" w:ascii="Malgun Gothic" w:hAnsi="Malgun Gothic"/>
           <w:b/>
           <w:sz w:val="26"/>
         </w:rPr>
@@ -807,21 +991,26 @@
         <w:tblLook w:firstColumn="1" w:firstRow="1" w:lastColumn="0" w:lastRow="0" w:noHBand="0" w:noVBand="1" w:val="04A0"/>
       </w:tblPr>
       <w:tblGrid>
-        <w:gridCol w:w="2880"/>
-        <w:gridCol w:w="2880"/>
-        <w:gridCol w:w="2880"/>
+        <w:gridCol w:w="2351"/>
+        <w:gridCol w:w="2351"/>
+        <w:gridCol w:w="2351"/>
+        <w:gridCol w:w="2351"/>
       </w:tblGrid>
       <w:tr>
         <w:tc>
           <w:tcPr>
-            <w:tcW w:type="dxa" w:w="2880"/>
+            <w:tcW w:type="dxa" w:w="2351"/>
+            <w:vAlign w:val="center"/>
+            <w:shd w:fill="E8EAF6"/>
           </w:tcPr>
           <w:p>
             <w:pPr>
               <w:jc w:val="center"/>
             </w:pPr>
+            <w:r/>
             <w:r>
               <w:rPr>
+                <w:rFonts w:eastAsia="Malgun Gothic" w:ascii="Malgun Gothic" w:hAnsi="Malgun Gothic"/>
                 <w:b/>
                 <w:sz w:val="20"/>
               </w:rPr>
@@ -831,14 +1020,18 @@
         </w:tc>
         <w:tc>
           <w:tcPr>
-            <w:tcW w:type="dxa" w:w="2880"/>
+            <w:tcW w:type="dxa" w:w="2351"/>
+            <w:vAlign w:val="center"/>
+            <w:shd w:fill="E8EAF6"/>
           </w:tcPr>
           <w:p>
             <w:pPr>
               <w:jc w:val="center"/>
             </w:pPr>
+            <w:r/>
             <w:r>
               <w:rPr>
+                <w:rFonts w:eastAsia="Malgun Gothic" w:ascii="Malgun Gothic" w:hAnsi="Malgun Gothic"/>
                 <w:b/>
                 <w:sz w:val="20"/>
               </w:rPr>
@@ -848,18 +1041,43 @@
         </w:tc>
         <w:tc>
           <w:tcPr>
-            <w:tcW w:type="dxa" w:w="2880"/>
+            <w:tcW w:type="dxa" w:w="2351"/>
+            <w:vAlign w:val="center"/>
+            <w:shd w:fill="E8EAF6"/>
           </w:tcPr>
           <w:p>
             <w:pPr>
               <w:jc w:val="center"/>
             </w:pPr>
+            <w:r/>
             <w:r>
               <w:rPr>
+                <w:rFonts w:eastAsia="Malgun Gothic" w:ascii="Malgun Gothic" w:hAnsi="Malgun Gothic"/>
                 <w:b/>
                 <w:sz w:val="20"/>
               </w:rPr>
-              <w:t>지급일 / 비고</w:t>
+              <w:t>지급일</w:t>
+            </w:r>
+          </w:p>
+        </w:tc>
+        <w:tc>
+          <w:tcPr>
+            <w:tcW w:type="dxa" w:w="2351"/>
+            <w:vAlign w:val="center"/>
+            <w:shd w:fill="E8EAF6"/>
+          </w:tcPr>
+          <w:p>
+            <w:pPr>
+              <w:jc w:val="center"/>
+            </w:pPr>
+            <w:r/>
+            <w:r>
+              <w:rPr>
+                <w:rFonts w:eastAsia="Malgun Gothic" w:ascii="Malgun Gothic" w:hAnsi="Malgun Gothic"/>
+                <w:b/>
+                <w:sz w:val="20"/>
+              </w:rPr>
+              <w:t>비 고</w:t>
             </w:r>
           </w:p>
         </w:tc>
@@ -867,52 +1085,74 @@
       <w:tr>
         <w:tc>
           <w:tcPr>
-            <w:tcW w:type="dxa" w:w="2880"/>
+            <w:tcW w:type="dxa" w:w="2351"/>
+            <w:vAlign w:val="center"/>
           </w:tcPr>
           <w:p>
             <w:pPr>
               <w:jc w:val="center"/>
             </w:pPr>
+            <w:r/>
             <w:r>
               <w:rPr>
-                <w:b/>
-                <w:sz w:val="20"/>
+                <w:rFonts w:eastAsia="Malgun Gothic" w:ascii="Malgun Gothic" w:hAnsi="Malgun Gothic"/>
+                <w:sz w:val="18"/>
               </w:rPr>
-              <w:t>매매대금 총액</w:t>
+              <w:t>매매대금총액</w:t>
             </w:r>
           </w:p>
         </w:tc>
         <w:tc>
           <w:tcPr>
-            <w:tcW w:type="dxa" w:w="2880"/>
+            <w:tcW w:type="dxa" w:w="2351"/>
+            <w:vAlign w:val="center"/>
           </w:tcPr>
           <w:p>
             <w:pPr>
               <w:jc w:val="center"/>
             </w:pPr>
+            <w:r/>
             <w:r>
               <w:rPr>
-                <w:b w:val="0"/>
-                <w:sz w:val="20"/>
+                <w:rFonts w:eastAsia="Malgun Gothic" w:ascii="Malgun Gothic" w:hAnsi="Malgun Gothic"/>
+                <w:sz w:val="18"/>
               </w:rPr>
-              <w:t>금 일억오천만원정</w:t>
-              <w:br/>
-              <w:t>(150,000,000원)</w:t>
+              <w:t>금 일억오천만원정 (₩150,000,000)</w:t>
             </w:r>
           </w:p>
         </w:tc>
         <w:tc>
           <w:tcPr>
-            <w:tcW w:type="dxa" w:w="2880"/>
+            <w:tcW w:type="dxa" w:w="2351"/>
+            <w:vAlign w:val="center"/>
           </w:tcPr>
           <w:p>
             <w:pPr>
               <w:jc w:val="center"/>
             </w:pPr>
+            <w:r/>
             <w:r>
               <w:rPr>
-                <w:b w:val="0"/>
-                <w:sz w:val="20"/>
+                <w:rFonts w:eastAsia="Malgun Gothic" w:ascii="Malgun Gothic" w:hAnsi="Malgun Gothic"/>
+                <w:sz w:val="18"/>
+              </w:rPr>
+            </w:r>
+          </w:p>
+        </w:tc>
+        <w:tc>
+          <w:tcPr>
+            <w:tcW w:type="dxa" w:w="2351"/>
+            <w:vAlign w:val="center"/>
+          </w:tcPr>
+          <w:p>
+            <w:pPr>
+              <w:jc w:val="center"/>
+            </w:pPr>
+            <w:r/>
+            <w:r>
+              <w:rPr>
+                <w:rFonts w:eastAsia="Malgun Gothic" w:ascii="Malgun Gothic" w:hAnsi="Malgun Gothic"/>
+                <w:sz w:val="18"/>
               </w:rPr>
             </w:r>
           </w:p>
@@ -921,16 +1161,18 @@
       <w:tr>
         <w:tc>
           <w:tcPr>
-            <w:tcW w:type="dxa" w:w="2880"/>
+            <w:tcW w:type="dxa" w:w="2351"/>
+            <w:vAlign w:val="center"/>
           </w:tcPr>
           <w:p>
             <w:pPr>
               <w:jc w:val="center"/>
             </w:pPr>
+            <w:r/>
             <w:r>
               <w:rPr>
-                <w:b/>
-                <w:sz w:val="20"/>
+                <w:rFonts w:eastAsia="Malgun Gothic" w:ascii="Malgun Gothic" w:hAnsi="Malgun Gothic"/>
+                <w:sz w:val="18"/>
               </w:rPr>
               <w:t>계 약 금</w:t>
             </w:r>
@@ -938,35 +1180,58 @@
         </w:tc>
         <w:tc>
           <w:tcPr>
-            <w:tcW w:type="dxa" w:w="2880"/>
+            <w:tcW w:type="dxa" w:w="2351"/>
+            <w:vAlign w:val="center"/>
           </w:tcPr>
           <w:p>
             <w:pPr>
               <w:jc w:val="center"/>
             </w:pPr>
+            <w:r/>
             <w:r>
               <w:rPr>
-                <w:b w:val="0"/>
-                <w:sz w:val="20"/>
+                <w:rFonts w:eastAsia="Malgun Gothic" w:ascii="Malgun Gothic" w:hAnsi="Malgun Gothic"/>
+                <w:sz w:val="18"/>
               </w:rPr>
-              <w:t>금                    원정</w:t>
+              <w:t>금              원정</w:t>
             </w:r>
           </w:p>
         </w:tc>
         <w:tc>
           <w:tcPr>
-            <w:tcW w:type="dxa" w:w="2880"/>
+            <w:tcW w:type="dxa" w:w="2351"/>
+            <w:vAlign w:val="center"/>
           </w:tcPr>
           <w:p>
             <w:pPr>
               <w:jc w:val="center"/>
             </w:pPr>
+            <w:r/>
             <w:r>
               <w:rPr>
-                <w:b w:val="0"/>
-                <w:sz w:val="20"/>
+                <w:rFonts w:eastAsia="Malgun Gothic" w:ascii="Malgun Gothic" w:hAnsi="Malgun Gothic"/>
+                <w:sz w:val="18"/>
               </w:rPr>
-              <w:t>계약 시 지급</w:t>
+              <w:t xml:space="preserve">  년  월  일</w:t>
+            </w:r>
+          </w:p>
+        </w:tc>
+        <w:tc>
+          <w:tcPr>
+            <w:tcW w:type="dxa" w:w="2351"/>
+            <w:vAlign w:val="center"/>
+          </w:tcPr>
+          <w:p>
+            <w:pPr>
+              <w:jc w:val="center"/>
+            </w:pPr>
+            <w:r/>
+            <w:r>
+              <w:rPr>
+                <w:rFonts w:eastAsia="Malgun Gothic" w:ascii="Malgun Gothic" w:hAnsi="Malgun Gothic"/>
+                <w:sz w:val="18"/>
+              </w:rPr>
+              <w:t>계약시 지급</w:t>
             </w:r>
           </w:p>
         </w:tc>
@@ -974,16 +1239,18 @@
       <w:tr>
         <w:tc>
           <w:tcPr>
-            <w:tcW w:type="dxa" w:w="2880"/>
+            <w:tcW w:type="dxa" w:w="2351"/>
+            <w:vAlign w:val="center"/>
           </w:tcPr>
           <w:p>
             <w:pPr>
               <w:jc w:val="center"/>
             </w:pPr>
+            <w:r/>
             <w:r>
               <w:rPr>
-                <w:b/>
-                <w:sz w:val="20"/>
+                <w:rFonts w:eastAsia="Malgun Gothic" w:ascii="Malgun Gothic" w:hAnsi="Malgun Gothic"/>
+                <w:sz w:val="18"/>
               </w:rPr>
               <w:t>상 계 금</w:t>
             </w:r>
@@ -991,35 +1258,58 @@
         </w:tc>
         <w:tc>
           <w:tcPr>
-            <w:tcW w:type="dxa" w:w="2880"/>
+            <w:tcW w:type="dxa" w:w="2351"/>
+            <w:vAlign w:val="center"/>
           </w:tcPr>
           <w:p>
             <w:pPr>
               <w:jc w:val="center"/>
             </w:pPr>
+            <w:r/>
             <w:r>
               <w:rPr>
-                <w:b w:val="0"/>
-                <w:sz w:val="20"/>
+                <w:rFonts w:eastAsia="Malgun Gothic" w:ascii="Malgun Gothic" w:hAnsi="Malgun Gothic"/>
+                <w:sz w:val="18"/>
               </w:rPr>
-              <w:t>금                    원정</w:t>
+              <w:t>금              원정</w:t>
             </w:r>
           </w:p>
         </w:tc>
         <w:tc>
           <w:tcPr>
-            <w:tcW w:type="dxa" w:w="2880"/>
+            <w:tcW w:type="dxa" w:w="2351"/>
+            <w:vAlign w:val="center"/>
           </w:tcPr>
           <w:p>
             <w:pPr>
               <w:jc w:val="center"/>
             </w:pPr>
+            <w:r/>
             <w:r>
               <w:rPr>
-                <w:b w:val="0"/>
-                <w:sz w:val="20"/>
+                <w:rFonts w:eastAsia="Malgun Gothic" w:ascii="Malgun Gothic" w:hAnsi="Malgun Gothic"/>
+                <w:sz w:val="18"/>
               </w:rPr>
-              <w:t>별쳊 상계합의서에 의함</w:t>
+              <w:t>상계합의서 참조</w:t>
+            </w:r>
+          </w:p>
+        </w:tc>
+        <w:tc>
+          <w:tcPr>
+            <w:tcW w:type="dxa" w:w="2351"/>
+            <w:vAlign w:val="center"/>
+          </w:tcPr>
+          <w:p>
+            <w:pPr>
+              <w:jc w:val="center"/>
+            </w:pPr>
+            <w:r/>
+            <w:r>
+              <w:rPr>
+                <w:rFonts w:eastAsia="Malgun Gothic" w:ascii="Malgun Gothic" w:hAnsi="Malgun Gothic"/>
+                <w:sz w:val="18"/>
+              </w:rPr>
+              <w:t>별쳊</w:t>
             </w:r>
           </w:p>
         </w:tc>
@@ -1027,16 +1317,18 @@
       <w:tr>
         <w:tc>
           <w:tcPr>
-            <w:tcW w:type="dxa" w:w="2880"/>
+            <w:tcW w:type="dxa" w:w="2351"/>
+            <w:vAlign w:val="center"/>
           </w:tcPr>
           <w:p>
             <w:pPr>
               <w:jc w:val="center"/>
             </w:pPr>
+            <w:r/>
             <w:r>
               <w:rPr>
-                <w:b/>
-                <w:sz w:val="20"/>
+                <w:rFonts w:eastAsia="Malgun Gothic" w:ascii="Malgun Gothic" w:hAnsi="Malgun Gothic"/>
+                <w:sz w:val="18"/>
               </w:rPr>
               <w:t>잔    금</w:t>
             </w:r>
@@ -1044,35 +1336,58 @@
         </w:tc>
         <w:tc>
           <w:tcPr>
-            <w:tcW w:type="dxa" w:w="2880"/>
+            <w:tcW w:type="dxa" w:w="2351"/>
+            <w:vAlign w:val="center"/>
           </w:tcPr>
           <w:p>
             <w:pPr>
               <w:jc w:val="center"/>
             </w:pPr>
+            <w:r/>
             <w:r>
               <w:rPr>
-                <w:b w:val="0"/>
-                <w:sz w:val="20"/>
+                <w:rFonts w:eastAsia="Malgun Gothic" w:ascii="Malgun Gothic" w:hAnsi="Malgun Gothic"/>
+                <w:sz w:val="18"/>
               </w:rPr>
-              <w:t>금                    원정</w:t>
+              <w:t>금              원정</w:t>
             </w:r>
           </w:p>
         </w:tc>
         <w:tc>
           <w:tcPr>
-            <w:tcW w:type="dxa" w:w="2880"/>
+            <w:tcW w:type="dxa" w:w="2351"/>
+            <w:vAlign w:val="center"/>
           </w:tcPr>
           <w:p>
             <w:pPr>
               <w:jc w:val="center"/>
             </w:pPr>
+            <w:r/>
             <w:r>
               <w:rPr>
-                <w:b w:val="0"/>
-                <w:sz w:val="20"/>
+                <w:rFonts w:eastAsia="Malgun Gothic" w:ascii="Malgun Gothic" w:hAnsi="Malgun Gothic"/>
+                <w:sz w:val="18"/>
               </w:rPr>
-              <w:t>20    년    월    일</w:t>
+              <w:t xml:space="preserve">  년  월  일</w:t>
+            </w:r>
+          </w:p>
+        </w:tc>
+        <w:tc>
+          <w:tcPr>
+            <w:tcW w:type="dxa" w:w="2351"/>
+            <w:vAlign w:val="center"/>
+          </w:tcPr>
+          <w:p>
+            <w:pPr>
+              <w:jc w:val="center"/>
+            </w:pPr>
+            <w:r/>
+            <w:r>
+              <w:rPr>
+                <w:rFonts w:eastAsia="Malgun Gothic" w:ascii="Malgun Gothic" w:hAnsi="Malgun Gothic"/>
+                <w:sz w:val="18"/>
+              </w:rPr>
+              <w:t>잔금 이체</w:t>
             </w:r>
           </w:p>
         </w:tc>
@@ -1082,6 +1397,7 @@
     <w:p>
       <w:r>
         <w:rPr>
+          <w:rFonts w:eastAsia="Malgun Gothic" w:ascii="Malgun Gothic" w:hAnsi="Malgun Gothic"/>
           <w:b/>
           <w:sz w:val="26"/>
         </w:rPr>
@@ -1091,6 +1407,7 @@
     <w:p>
       <w:r>
         <w:rPr>
+          <w:rFonts w:eastAsia="Malgun Gothic" w:ascii="Malgun Gothic" w:hAnsi="Malgun Gothic"/>
           <w:b/>
           <w:sz w:val="22"/>
         </w:rPr>
@@ -1099,62 +1416,303 @@
     </w:p>
     <w:p>
       <w:pPr>
-        <w:ind w:left="567"/>
+        <w:ind w:left="283"/>
       </w:pPr>
       <w:r>
         <w:rPr>
+          <w:rFonts w:eastAsia="Malgun Gothic" w:ascii="Malgun Gothic" w:hAnsi="Malgun Gothic"/>
+          <w:b w:val="0"/>
           <w:sz w:val="20"/>
         </w:rPr>
-        <w:t>1. 본 매매가액은 상속세 및 증여세법 제35조(저가 양수에 따른 이익의 증여)의 기준을 고려하여 당사자 간 합의로 설정하였다.</w:t>
+        <w:t>① 본 매매가액은 「상속세 및 증여세법」 제35조(저가 양수에 따른 이익의 증여)의 기준을 고려하여 당사자 간 합의로 설정하였다.</w:t>
       </w:r>
     </w:p>
     <w:p>
       <w:pPr>
-        <w:ind w:left="567"/>
+        <w:ind w:left="283"/>
       </w:pPr>
       <w:r>
         <w:rPr>
+          <w:rFonts w:eastAsia="Malgun Gothic" w:ascii="Malgun Gothic" w:hAnsi="Malgun Gothic"/>
+          <w:b w:val="0"/>
           <w:sz w:val="20"/>
         </w:rPr>
-        <w:t>2. 시가 산정 근거: 동일 단지 유사 면적(50B㎡) 최근 실거래가를 참고하였으며, 해당 호수의 개별 사정(층수, 향, 노후도, 내부 상태 등)을 반영하였다.</w:t>
+        <w:t>② 시가 산정 근거:</w:t>
       </w:r>
     </w:p>
+    <w:tbl>
+      <w:tblPr>
+        <w:tblStyle w:val="TableGrid"/>
+        <w:tblW w:type="auto" w:w="0"/>
+        <w:jc w:val="center"/>
+        <w:tblLook w:firstColumn="1" w:firstRow="1" w:lastColumn="0" w:lastRow="0" w:noHBand="0" w:noVBand="1" w:val="04A0"/>
+      </w:tblPr>
+      <w:tblGrid>
+        <w:gridCol w:w="3135"/>
+        <w:gridCol w:w="3135"/>
+        <w:gridCol w:w="3135"/>
+      </w:tblGrid>
+      <w:tr>
+        <w:tc>
+          <w:tcPr>
+            <w:tcW w:type="dxa" w:w="3135"/>
+            <w:vAlign w:val="center"/>
+            <w:shd w:fill="E8EAF6"/>
+          </w:tcPr>
+          <w:p>
+            <w:pPr>
+              <w:jc w:val="center"/>
+            </w:pPr>
+            <w:r/>
+            <w:r>
+              <w:rPr>
+                <w:rFonts w:eastAsia="Malgun Gothic" w:ascii="Malgun Gothic" w:hAnsi="Malgun Gothic"/>
+                <w:b/>
+                <w:sz w:val="20"/>
+              </w:rPr>
+              <w:t>기준</w:t>
+            </w:r>
+          </w:p>
+        </w:tc>
+        <w:tc>
+          <w:tcPr>
+            <w:tcW w:type="dxa" w:w="3135"/>
+            <w:vAlign w:val="center"/>
+            <w:shd w:fill="E8EAF6"/>
+          </w:tcPr>
+          <w:p>
+            <w:pPr>
+              <w:jc w:val="center"/>
+            </w:pPr>
+            <w:r/>
+            <w:r>
+              <w:rPr>
+                <w:rFonts w:eastAsia="Malgun Gothic" w:ascii="Malgun Gothic" w:hAnsi="Malgun Gothic"/>
+                <w:b/>
+                <w:sz w:val="20"/>
+              </w:rPr>
+              <w:t>거래가</w:t>
+            </w:r>
+          </w:p>
+        </w:tc>
+        <w:tc>
+          <w:tcPr>
+            <w:tcW w:type="dxa" w:w="3135"/>
+            <w:vAlign w:val="center"/>
+            <w:shd w:fill="E8EAF6"/>
+          </w:tcPr>
+          <w:p>
+            <w:pPr>
+              <w:jc w:val="center"/>
+            </w:pPr>
+            <w:r/>
+            <w:r>
+              <w:rPr>
+                <w:rFonts w:eastAsia="Malgun Gothic" w:ascii="Malgun Gothic" w:hAnsi="Malgun Gothic"/>
+                <w:b/>
+                <w:sz w:val="20"/>
+              </w:rPr>
+              <w:t>출처</w:t>
+            </w:r>
+          </w:p>
+        </w:tc>
+      </w:tr>
+      <w:tr>
+        <w:tc>
+          <w:tcPr>
+            <w:tcW w:type="dxa" w:w="3135"/>
+            <w:vAlign w:val="center"/>
+          </w:tcPr>
+          <w:p>
+            <w:pPr>
+              <w:jc w:val="center"/>
+            </w:pPr>
+            <w:r/>
+            <w:r>
+              <w:rPr>
+                <w:rFonts w:eastAsia="Malgun Gothic" w:ascii="Malgun Gothic" w:hAnsi="Malgun Gothic"/>
+                <w:sz w:val="18"/>
+              </w:rPr>
+              <w:t>최근 실거래 (2026.01)</w:t>
+            </w:r>
+          </w:p>
+        </w:tc>
+        <w:tc>
+          <w:tcPr>
+            <w:tcW w:type="dxa" w:w="3135"/>
+            <w:vAlign w:val="center"/>
+          </w:tcPr>
+          <w:p>
+            <w:pPr>
+              <w:jc w:val="center"/>
+            </w:pPr>
+            <w:r/>
+            <w:r>
+              <w:rPr>
+                <w:rFonts w:eastAsia="Malgun Gothic" w:ascii="Malgun Gothic" w:hAnsi="Malgun Gothic"/>
+                <w:sz w:val="18"/>
+              </w:rPr>
+              <w:t>2억 3,000만원 (12층)</w:t>
+            </w:r>
+          </w:p>
+        </w:tc>
+        <w:tc>
+          <w:tcPr>
+            <w:tcW w:type="dxa" w:w="3135"/>
+            <w:vAlign w:val="center"/>
+          </w:tcPr>
+          <w:p>
+            <w:pPr>
+              <w:jc w:val="center"/>
+            </w:pPr>
+            <w:r/>
+            <w:r>
+              <w:rPr>
+                <w:rFonts w:eastAsia="Malgun Gothic" w:ascii="Malgun Gothic" w:hAnsi="Malgun Gothic"/>
+                <w:sz w:val="18"/>
+              </w:rPr>
+              <w:t>국토교통부 실거래가</w:t>
+            </w:r>
+          </w:p>
+        </w:tc>
+      </w:tr>
+      <w:tr>
+        <w:tc>
+          <w:tcPr>
+            <w:tcW w:type="dxa" w:w="3135"/>
+            <w:vAlign w:val="center"/>
+          </w:tcPr>
+          <w:p>
+            <w:pPr>
+              <w:jc w:val="center"/>
+            </w:pPr>
+            <w:r/>
+            <w:r>
+              <w:rPr>
+                <w:rFonts w:eastAsia="Malgun Gothic" w:ascii="Malgun Gothic" w:hAnsi="Malgun Gothic"/>
+                <w:sz w:val="18"/>
+              </w:rPr>
+              <w:t>최근 3개월 평균</w:t>
+            </w:r>
+          </w:p>
+        </w:tc>
+        <w:tc>
+          <w:tcPr>
+            <w:tcW w:type="dxa" w:w="3135"/>
+            <w:vAlign w:val="center"/>
+          </w:tcPr>
+          <w:p>
+            <w:pPr>
+              <w:jc w:val="center"/>
+            </w:pPr>
+            <w:r/>
+            <w:r>
+              <w:rPr>
+                <w:rFonts w:eastAsia="Malgun Gothic" w:ascii="Malgun Gothic" w:hAnsi="Malgun Gothic"/>
+                <w:sz w:val="18"/>
+              </w:rPr>
+              <w:t>약 2억 4,600만원</w:t>
+            </w:r>
+          </w:p>
+        </w:tc>
+        <w:tc>
+          <w:tcPr>
+            <w:tcW w:type="dxa" w:w="3135"/>
+            <w:vAlign w:val="center"/>
+          </w:tcPr>
+          <w:p>
+            <w:pPr>
+              <w:jc w:val="center"/>
+            </w:pPr>
+            <w:r/>
+            <w:r>
+              <w:rPr>
+                <w:rFonts w:eastAsia="Malgun Gothic" w:ascii="Malgun Gothic" w:hAnsi="Malgun Gothic"/>
+                <w:sz w:val="18"/>
+              </w:rPr>
+              <w:t>국토교통부 실거래가</w:t>
+            </w:r>
+          </w:p>
+        </w:tc>
+      </w:tr>
+      <w:tr>
+        <w:tc>
+          <w:tcPr>
+            <w:tcW w:type="dxa" w:w="3135"/>
+            <w:vAlign w:val="center"/>
+          </w:tcPr>
+          <w:p>
+            <w:pPr>
+              <w:jc w:val="center"/>
+            </w:pPr>
+            <w:r/>
+            <w:r>
+              <w:rPr>
+                <w:rFonts w:eastAsia="Malgun Gothic" w:ascii="Malgun Gothic" w:hAnsi="Malgun Gothic"/>
+                <w:sz w:val="18"/>
+              </w:rPr>
+              <w:t>감정평가액 (별쳊)</w:t>
+            </w:r>
+          </w:p>
+        </w:tc>
+        <w:tc>
+          <w:tcPr>
+            <w:tcW w:type="dxa" w:w="3135"/>
+            <w:vAlign w:val="center"/>
+          </w:tcPr>
+          <w:p>
+            <w:pPr>
+              <w:jc w:val="center"/>
+            </w:pPr>
+            <w:r/>
+            <w:r>
+              <w:rPr>
+                <w:rFonts w:eastAsia="Malgun Gothic" w:ascii="Malgun Gothic" w:hAnsi="Malgun Gothic"/>
+                <w:sz w:val="18"/>
+              </w:rPr>
+              <w:t>원</w:t>
+            </w:r>
+          </w:p>
+        </w:tc>
+        <w:tc>
+          <w:tcPr>
+            <w:tcW w:type="dxa" w:w="3135"/>
+            <w:vAlign w:val="center"/>
+          </w:tcPr>
+          <w:p>
+            <w:pPr>
+              <w:jc w:val="center"/>
+            </w:pPr>
+            <w:r/>
+            <w:r>
+              <w:rPr>
+                <w:rFonts w:eastAsia="Malgun Gothic" w:ascii="Malgun Gothic" w:hAnsi="Malgun Gothic"/>
+                <w:sz w:val="18"/>
+              </w:rPr>
+              <w:t>감정평가사</w:t>
+            </w:r>
+          </w:p>
+        </w:tc>
+      </w:tr>
+    </w:tbl>
     <w:p>
       <w:pPr>
-        <w:ind w:left="567"/>
+        <w:ind w:left="283"/>
       </w:pPr>
       <w:r>
         <w:rPr>
+          <w:rFonts w:eastAsia="Malgun Gothic" w:ascii="Malgun Gothic" w:hAnsi="Malgun Gothic"/>
+          <w:b w:val="0"/>
           <w:sz w:val="20"/>
         </w:rPr>
-        <w:t xml:space="preserve">   - 최근 실거래가: 2026.01 12층 2억 3,000만원 (국토교통부 실거래가 공개시스템)</w:t>
+        <w:t>③ 감정평가서가 있는 경우 감정평가액을 시가로 우선 적용한다.</w:t>
       </w:r>
     </w:p>
-    <w:p>
-      <w:pPr>
-        <w:ind w:left="567"/>
-      </w:pPr>
-      <w:r>
-        <w:rPr>
-          <w:sz w:val="20"/>
-        </w:rPr>
-        <w:t xml:space="preserve">   - 최근 3개월 평균: 약 2억 4,600만원</w:t>
-      </w:r>
-    </w:p>
-    <w:p>
-      <w:pPr>
-        <w:ind w:left="567"/>
-      </w:pPr>
-      <w:r>
-        <w:rPr>
-          <w:sz w:val="20"/>
-        </w:rPr>
-        <w:t>3. 감정평가서가 있는 경우, 감정평가액을 시가로 우선 적용한다. (별쳊)</w:t>
-      </w:r>
-    </w:p>
+    <w:p/>
     <w:p>
       <w:r>
         <w:rPr>
+          <w:rFonts w:eastAsia="Malgun Gothic" w:ascii="Malgun Gothic" w:hAnsi="Malgun Gothic"/>
           <w:b/>
           <w:sz w:val="22"/>
         </w:rPr>
@@ -1163,51 +1721,61 @@
     </w:p>
     <w:p>
       <w:pPr>
-        <w:ind w:left="567"/>
+        <w:ind w:left="283"/>
       </w:pPr>
       <w:r>
         <w:rPr>
+          <w:rFonts w:eastAsia="Malgun Gothic" w:ascii="Malgun Gothic" w:hAnsi="Malgun Gothic"/>
+          <w:b w:val="0"/>
           <w:sz w:val="20"/>
         </w:rPr>
-        <w:t>1. 계약금은 계약 체결 시 매수인이 매도인의 지정 계좌로 이체한다.</w:t>
+        <w:t>① 계약금은 계약 체결 시 매수인이 매도인의 지정 계좌로 이체한다.</w:t>
       </w:r>
     </w:p>
     <w:p>
       <w:pPr>
-        <w:ind w:left="567"/>
+        <w:ind w:left="283"/>
       </w:pPr>
       <w:r>
         <w:rPr>
+          <w:rFonts w:eastAsia="Malgun Gothic" w:ascii="Malgun Gothic" w:hAnsi="Malgun Gothic"/>
+          <w:b w:val="0"/>
           <w:sz w:val="20"/>
         </w:rPr>
-        <w:t>2. 상계금은 매도인의 매수인에 대한 기존 채무(별쳊 채권채무 확인서 및 상계 합의서 참조)와 상계 처리한다.</w:t>
+        <w:t>② 상계금은 매도인의 매수인에 대한 기존 채무(별쳊 「채권채무 확인서 및 상계 합의서」 참조)와 상계 처리한다.</w:t>
       </w:r>
     </w:p>
     <w:p>
       <w:pPr>
-        <w:ind w:left="567"/>
+        <w:ind w:left="283"/>
       </w:pPr>
       <w:r>
         <w:rPr>
+          <w:rFonts w:eastAsia="Malgun Gothic" w:ascii="Malgun Gothic" w:hAnsi="Malgun Gothic"/>
+          <w:b w:val="0"/>
           <w:sz w:val="20"/>
         </w:rPr>
-        <w:t>3. 잔금은 위 지급일까지 매도인의 지정 계좌로 이체하며, 이체 확인증을 보관한다.</w:t>
+        <w:t>③ 잔금은 위 지급일까지 매도인의 지정 계좌로 이체하며, 이체 확인증을 보관한다.</w:t>
       </w:r>
     </w:p>
     <w:p>
       <w:pPr>
-        <w:ind w:left="567"/>
+        <w:ind w:left="283"/>
       </w:pPr>
       <w:r>
         <w:rPr>
+          <w:rFonts w:eastAsia="Malgun Gothic" w:ascii="Malgun Gothic" w:hAnsi="Malgun Gothic"/>
+          <w:b w:val="0"/>
           <w:sz w:val="20"/>
         </w:rPr>
-        <w:t>4. 모든 대금 지급은 반드시 계좌이체로 하며, 현금 지급은 불인정한다.</w:t>
+        <w:t>④ 모든 대금 지급은 반드시 계좌이체로 하며, 현금 지급은 불인정한다.</w:t>
       </w:r>
     </w:p>
+    <w:p/>
     <w:p>
       <w:r>
         <w:rPr>
+          <w:rFonts w:eastAsia="Malgun Gothic" w:ascii="Malgun Gothic" w:hAnsi="Malgun Gothic"/>
           <w:b/>
           <w:sz w:val="22"/>
         </w:rPr>
@@ -1216,29 +1784,35 @@
     </w:p>
     <w:p>
       <w:pPr>
-        <w:ind w:left="567"/>
+        <w:ind w:left="283"/>
       </w:pPr>
       <w:r>
         <w:rPr>
+          <w:rFonts w:eastAsia="Malgun Gothic" w:ascii="Malgun Gothic" w:hAnsi="Malgun Gothic"/>
+          <w:b w:val="0"/>
           <w:sz w:val="20"/>
         </w:rPr>
-        <w:t>1. 매도인은 잔금 수령과 동시에 매수인 명의로 소유권이전등기에 필요한 일체의 서류를 교부한다.</w:t>
+        <w:t>① 매도인은 잔금 수령과 동시에 매수인 명의로 소유권이전등기에 필요한 일체의 서류를 교부한다.</w:t>
       </w:r>
     </w:p>
     <w:p>
       <w:pPr>
-        <w:ind w:left="567"/>
+        <w:ind w:left="283"/>
       </w:pPr>
       <w:r>
         <w:rPr>
+          <w:rFonts w:eastAsia="Malgun Gothic" w:ascii="Malgun Gothic" w:hAnsi="Malgun Gothic"/>
+          <w:b w:val="0"/>
           <w:sz w:val="20"/>
         </w:rPr>
-        <w:t>2. 등기비용(취득세, 등록면허세, 법무사 수수료 등)은 매수인이 부담한다.</w:t>
+        <w:t>② 등기비용(취득세, 등록면허세, 법무사 수수료 등)은 매수인이 부담한다.</w:t>
       </w:r>
     </w:p>
+    <w:p/>
     <w:p>
       <w:r>
         <w:rPr>
+          <w:rFonts w:eastAsia="Malgun Gothic" w:ascii="Malgun Gothic" w:hAnsi="Malgun Gothic"/>
           <w:b/>
           <w:sz w:val="22"/>
         </w:rPr>
@@ -1247,51 +1821,171 @@
     </w:p>
     <w:p>
       <w:pPr>
-        <w:ind w:left="567"/>
+        <w:ind w:left="283"/>
       </w:pPr>
       <w:r>
         <w:rPr>
+          <w:rFonts w:eastAsia="Malgun Gothic" w:ascii="Malgun Gothic" w:hAnsi="Malgun Gothic"/>
+          <w:b w:val="0"/>
           <w:sz w:val="20"/>
         </w:rPr>
-        <w:t>1. 본 부동산에 설정된 임대차 관계는 매수인이 그대로 승계한다.</w:t>
+        <w:t>① 본 부동산에 설정된 임대차 관계는 매수인이 그대로 승계한다.</w:t>
       </w:r>
     </w:p>
+    <w:tbl>
+      <w:tblPr>
+        <w:tblStyle w:val="TableGrid"/>
+        <w:tblW w:type="auto" w:w="0"/>
+        <w:jc w:val="center"/>
+        <w:tblLook w:firstColumn="1" w:firstRow="1" w:lastColumn="0" w:lastRow="0" w:noHBand="0" w:noVBand="1" w:val="04A0"/>
+      </w:tblPr>
+      <w:tblGrid>
+        <w:gridCol w:w="4703"/>
+        <w:gridCol w:w="4703"/>
+      </w:tblGrid>
+      <w:tr>
+        <w:tc>
+          <w:tcPr>
+            <w:tcW w:type="dxa" w:w="4703"/>
+            <w:vAlign w:val="center"/>
+            <w:shd w:fill="E8EAF6"/>
+          </w:tcPr>
+          <w:p>
+            <w:pPr>
+              <w:jc w:val="center"/>
+            </w:pPr>
+            <w:r/>
+            <w:r>
+              <w:rPr>
+                <w:rFonts w:eastAsia="Malgun Gothic" w:ascii="Malgun Gothic" w:hAnsi="Malgun Gothic"/>
+                <w:b/>
+                <w:sz w:val="20"/>
+              </w:rPr>
+              <w:t>항 목</w:t>
+            </w:r>
+          </w:p>
+        </w:tc>
+        <w:tc>
+          <w:tcPr>
+            <w:tcW w:type="dxa" w:w="4703"/>
+            <w:vAlign w:val="center"/>
+            <w:shd w:fill="E8EAF6"/>
+          </w:tcPr>
+          <w:p>
+            <w:pPr>
+              <w:jc w:val="center"/>
+            </w:pPr>
+            <w:r/>
+            <w:r>
+              <w:rPr>
+                <w:rFonts w:eastAsia="Malgun Gothic" w:ascii="Malgun Gothic" w:hAnsi="Malgun Gothic"/>
+                <w:b/>
+                <w:sz w:val="20"/>
+              </w:rPr>
+              <w:t>내 용</w:t>
+            </w:r>
+          </w:p>
+        </w:tc>
+      </w:tr>
+      <w:tr>
+        <w:tc>
+          <w:tcPr>
+            <w:tcW w:type="dxa" w:w="4703"/>
+            <w:vAlign w:val="center"/>
+          </w:tcPr>
+          <w:p>
+            <w:pPr>
+              <w:jc w:val="center"/>
+            </w:pPr>
+            <w:r/>
+            <w:r>
+              <w:rPr>
+                <w:rFonts w:eastAsia="Malgun Gothic" w:ascii="Malgun Gothic" w:hAnsi="Malgun Gothic"/>
+                <w:sz w:val="18"/>
+              </w:rPr>
+              <w:t>전세보증금</w:t>
+            </w:r>
+          </w:p>
+        </w:tc>
+        <w:tc>
+          <w:tcPr>
+            <w:tcW w:type="dxa" w:w="4703"/>
+            <w:vAlign w:val="center"/>
+          </w:tcPr>
+          <w:p>
+            <w:pPr>
+              <w:jc w:val="center"/>
+            </w:pPr>
+            <w:r/>
+            <w:r>
+              <w:rPr>
+                <w:rFonts w:eastAsia="Malgun Gothic" w:ascii="Malgun Gothic" w:hAnsi="Malgun Gothic"/>
+                <w:sz w:val="18"/>
+              </w:rPr>
+              <w:t>금                              원</w:t>
+            </w:r>
+          </w:p>
+        </w:tc>
+      </w:tr>
+      <w:tr>
+        <w:tc>
+          <w:tcPr>
+            <w:tcW w:type="dxa" w:w="4703"/>
+            <w:vAlign w:val="center"/>
+          </w:tcPr>
+          <w:p>
+            <w:pPr>
+              <w:jc w:val="center"/>
+            </w:pPr>
+            <w:r/>
+            <w:r>
+              <w:rPr>
+                <w:rFonts w:eastAsia="Malgun Gothic" w:ascii="Malgun Gothic" w:hAnsi="Malgun Gothic"/>
+                <w:sz w:val="18"/>
+              </w:rPr>
+              <w:t>임대차 만기일</w:t>
+            </w:r>
+          </w:p>
+        </w:tc>
+        <w:tc>
+          <w:tcPr>
+            <w:tcW w:type="dxa" w:w="4703"/>
+            <w:vAlign w:val="center"/>
+          </w:tcPr>
+          <w:p>
+            <w:pPr>
+              <w:jc w:val="center"/>
+            </w:pPr>
+            <w:r/>
+            <w:r>
+              <w:rPr>
+                <w:rFonts w:eastAsia="Malgun Gothic" w:ascii="Malgun Gothic" w:hAnsi="Malgun Gothic"/>
+                <w:sz w:val="18"/>
+              </w:rPr>
+              <w:t xml:space="preserve">    년    월    일</w:t>
+            </w:r>
+          </w:p>
+        </w:tc>
+      </w:tr>
+    </w:tbl>
     <w:p>
       <w:pPr>
-        <w:ind w:left="567"/>
+        <w:ind w:left="283"/>
       </w:pPr>
       <w:r>
         <w:rPr>
+          <w:rFonts w:eastAsia="Malgun Gothic" w:ascii="Malgun Gothic" w:hAnsi="Malgun Gothic"/>
+          <w:b w:val="0"/>
           <w:sz w:val="20"/>
         </w:rPr>
-        <w:t xml:space="preserve">   - 전세보증금: 금                    원</w:t>
+        <w:t>② 매도인은 임차인에게 임대인 변경 사실을 서면으로 통지한다.</w:t>
       </w:r>
     </w:p>
-    <w:p>
-      <w:pPr>
-        <w:ind w:left="567"/>
-      </w:pPr>
-      <w:r>
-        <w:rPr>
-          <w:sz w:val="20"/>
-        </w:rPr>
-        <w:t xml:space="preserve">   - 임대차 만기일: 20    년    월    일</w:t>
-      </w:r>
-    </w:p>
-    <w:p>
-      <w:pPr>
-        <w:ind w:left="567"/>
-      </w:pPr>
-      <w:r>
-        <w:rPr>
-          <w:sz w:val="20"/>
-        </w:rPr>
-        <w:t>2. 매도인은 임차인에게 임대인 변경 사실을 서면으로 통지한다.</w:t>
-      </w:r>
-    </w:p>
+    <w:p/>
     <w:p>
       <w:r>
         <w:rPr>
+          <w:rFonts w:eastAsia="Malgun Gothic" w:ascii="Malgun Gothic" w:hAnsi="Malgun Gothic"/>
           <w:b/>
           <w:sz w:val="22"/>
         </w:rPr>
@@ -1300,18 +1994,22 @@
     </w:p>
     <w:p>
       <w:pPr>
-        <w:ind w:left="567"/>
+        <w:ind w:left="283"/>
       </w:pPr>
       <w:r>
         <w:rPr>
+          <w:rFonts w:eastAsia="Malgun Gothic" w:ascii="Malgun Gothic" w:hAnsi="Malgun Gothic"/>
+          <w:b w:val="0"/>
           <w:sz w:val="20"/>
         </w:rPr>
-        <w:t>1. 매도인은 잔금 수령일까지 본 부동산에 설정된 근저당권, 가압류, 가처분 등 일체의 부담을 말소한다.</w:t>
+        <w:t>① 매도인은 잔금 수령일까지 본 부동산에 설정된 근저당권, 가압류, 가처분 등 일체의 부담을 말소한다.</w:t>
       </w:r>
     </w:p>
+    <w:p/>
     <w:p>
       <w:r>
         <w:rPr>
+          <w:rFonts w:eastAsia="Malgun Gothic" w:ascii="Malgun Gothic" w:hAnsi="Malgun Gothic"/>
           <w:b/>
           <w:sz w:val="22"/>
         </w:rPr>
@@ -1320,63 +2018,74 @@
     </w:p>
     <w:p>
       <w:pPr>
-        <w:ind w:left="567"/>
+        <w:ind w:left="283"/>
       </w:pPr>
       <w:r>
         <w:rPr>
+          <w:rFonts w:eastAsia="Malgun Gothic" w:ascii="Malgun Gothic" w:hAnsi="Malgun Gothic"/>
+          <w:b w:val="0"/>
           <w:sz w:val="20"/>
         </w:rPr>
-        <w:t>1. 매도인과 매수인은 직계 가족(부녀) 관계임을 확인한다.</w:t>
+        <w:t>① 매도인과 매수인은 직계 가족(부녀) 관계임을 확인한다.</w:t>
       </w:r>
     </w:p>
     <w:p>
       <w:pPr>
-        <w:ind w:left="567"/>
+        <w:ind w:left="283"/>
       </w:pPr>
       <w:r>
         <w:rPr>
+          <w:rFonts w:eastAsia="Malgun Gothic" w:ascii="Malgun Gothic" w:hAnsi="Malgun Gothic"/>
+          <w:b w:val="0"/>
           <w:sz w:val="20"/>
         </w:rPr>
-        <w:t>2. 본 거래는 가족 간 유상거래이며, 매매대금 전액이 실제 지급(현금 이체 또는 채무 상계)됨을 쌍방 확인한다.</w:t>
+        <w:t>② 본 거래는 가족 간 유상거래이며, 매매대금 전액이 실제 지급(현금 이체 또는 채무 상계)됨을 쌍방 확인한다.</w:t>
       </w:r>
     </w:p>
     <w:p>
       <w:pPr>
-        <w:ind w:left="567"/>
+        <w:ind w:left="283"/>
       </w:pPr>
       <w:r>
         <w:rPr>
+          <w:rFonts w:eastAsia="Malgun Gothic" w:ascii="Malgun Gothic" w:hAnsi="Malgun Gothic"/>
+          <w:b w:val="0"/>
           <w:sz w:val="20"/>
         </w:rPr>
-        <w:t>3. 과거 자금 관계 정리를 위한 상계 내역은 별쳊 채권채무 확인서 및 상계 합의서에 따른다.</w:t>
+        <w:t>③ 과거 자금 관계 정리를 위한 상계 내역은 별쳊 「채권채무 확인서 및 상계 합의서」에 따른다.</w:t>
       </w:r>
     </w:p>
     <w:p>
       <w:pPr>
-        <w:ind w:left="567"/>
+        <w:ind w:left="283"/>
       </w:pPr>
       <w:r>
         <w:rPr>
+          <w:rFonts w:eastAsia="Malgun Gothic" w:ascii="Malgun Gothic" w:hAnsi="Malgun Gothic"/>
+          <w:b w:val="0"/>
           <w:sz w:val="20"/>
         </w:rPr>
-        <w:t>4. 본 계약에 따른 증여세 신고 의무가 발생하는 경우, 매수인이 법정 기한 내 자진 신고한다.</w:t>
+        <w:t>④ 본 계약에 따른 증여세 신고 의무가 발생하는 경우, 매수인이 법정 기한 내 자진 신고한다.</w:t>
       </w:r>
     </w:p>
     <w:p>
       <w:pPr>
-        <w:ind w:left="567"/>
+        <w:ind w:left="283"/>
       </w:pPr>
       <w:r>
         <w:rPr>
+          <w:rFonts w:eastAsia="Malgun Gothic" w:ascii="Malgun Gothic" w:hAnsi="Malgun Gothic"/>
+          <w:b w:val="0"/>
           <w:sz w:val="20"/>
         </w:rPr>
-        <w:t>5. 기타 본 계약에 명시되지 않은 사항은 민법 및 관련 법령에 따른다.</w:t>
+        <w:t>⑤ 기타 본 계약에 명시되지 않은 사항은 민법 및 관련 법령에 따른다.</w:t>
       </w:r>
     </w:p>
     <w:p/>
     <w:p>
       <w:r>
         <w:rPr>
+          <w:rFonts w:eastAsia="Malgun Gothic" w:ascii="Malgun Gothic" w:hAnsi="Malgun Gothic"/>
           <w:b/>
           <w:sz w:val="26"/>
         </w:rPr>
@@ -1385,10 +2094,12 @@
     </w:p>
     <w:p>
       <w:pPr>
-        <w:ind w:left="567"/>
+        <w:ind w:left="283"/>
       </w:pPr>
       <w:r>
         <w:rPr>
+          <w:rFonts w:eastAsia="Malgun Gothic" w:ascii="Malgun Gothic" w:hAnsi="Malgun Gothic"/>
+          <w:b w:val="0"/>
           <w:sz w:val="20"/>
         </w:rPr>
         <w:t>1. 채권채무 확인서 및 상계 합의서</w:t>
@@ -1396,10 +2107,12 @@
     </w:p>
     <w:p>
       <w:pPr>
-        <w:ind w:left="567"/>
+        <w:ind w:left="283"/>
       </w:pPr>
       <w:r>
         <w:rPr>
+          <w:rFonts w:eastAsia="Malgun Gothic" w:ascii="Malgun Gothic" w:hAnsi="Malgun Gothic"/>
+          <w:b w:val="0"/>
           <w:sz w:val="20"/>
         </w:rPr>
         <w:t>2. 계좌 이체 내역 (과거 자금 흐름 증빙)</w:t>
@@ -1407,10 +2120,12 @@
     </w:p>
     <w:p>
       <w:pPr>
-        <w:ind w:left="567"/>
+        <w:ind w:left="283"/>
       </w:pPr>
       <w:r>
         <w:rPr>
+          <w:rFonts w:eastAsia="Malgun Gothic" w:ascii="Malgun Gothic" w:hAnsi="Malgun Gothic"/>
+          <w:b w:val="0"/>
           <w:sz w:val="20"/>
         </w:rPr>
         <w:t>3. 감정평가서 (해당 시)</w:t>
@@ -1418,10 +2133,12 @@
     </w:p>
     <w:p>
       <w:pPr>
-        <w:ind w:left="567"/>
+        <w:ind w:left="283"/>
       </w:pPr>
       <w:r>
         <w:rPr>
+          <w:rFonts w:eastAsia="Malgun Gothic" w:ascii="Malgun Gothic" w:hAnsi="Malgun Gothic"/>
+          <w:b w:val="0"/>
           <w:sz w:val="20"/>
         </w:rPr>
         <w:t>4. 부동산 등기부등본</w:t>
@@ -1429,10 +2146,12 @@
     </w:p>
     <w:p>
       <w:pPr>
-        <w:ind w:left="567"/>
+        <w:ind w:left="283"/>
       </w:pPr>
       <w:r>
         <w:rPr>
+          <w:rFonts w:eastAsia="Malgun Gothic" w:ascii="Malgun Gothic" w:hAnsi="Malgun Gothic"/>
+          <w:b w:val="0"/>
           <w:sz w:val="20"/>
         </w:rPr>
         <w:t>5. 건축물대장</w:t>
@@ -1440,10 +2159,12 @@
     </w:p>
     <w:p>
       <w:pPr>
-        <w:ind w:left="567"/>
+        <w:ind w:left="283"/>
       </w:pPr>
       <w:r>
         <w:rPr>
+          <w:rFonts w:eastAsia="Malgun Gothic" w:ascii="Malgun Gothic" w:hAnsi="Malgun Gothic"/>
+          <w:b w:val="0"/>
           <w:sz w:val="20"/>
         </w:rPr>
         <w:t>6. 임대차계약서 사본 (해당 시)</w:t>
@@ -1457,6 +2178,8 @@
       </w:pPr>
       <w:r>
         <w:rPr>
+          <w:rFonts w:eastAsia="Malgun Gothic" w:ascii="Malgun Gothic" w:hAnsi="Malgun Gothic"/>
+          <w:b w:val="0"/>
           <w:sz w:val="22"/>
         </w:rPr>
         <w:t>위 계약 내용을 확인하고 이에 서명 날인한다.</w:t>
@@ -1469,6 +2192,8 @@
       </w:pPr>
       <w:r>
         <w:rPr>
+          <w:rFonts w:eastAsia="Malgun Gothic" w:ascii="Malgun Gothic" w:hAnsi="Malgun Gothic"/>
+          <w:b w:val="0"/>
           <w:sz w:val="26"/>
         </w:rPr>
         <w:t>20      년      월      일</w:t>
@@ -1476,61 +2201,409 @@
     </w:p>
     <w:p/>
     <w:p/>
-    <w:p>
-      <w:r>
-        <w:rPr>
-          <w:b/>
-          <w:sz w:val="24"/>
-        </w:rPr>
-        <w:t>매도인 (갑)</w:t>
-      </w:r>
-    </w:p>
-    <w:p>
-      <w:r>
-        <w:rPr>
-          <w:sz w:val="24"/>
-        </w:rPr>
-        <w:t xml:space="preserve">   성 명:                                        (인)</w:t>
-      </w:r>
-    </w:p>
-    <w:p>
-      <w:r>
-        <w:rPr>
-          <w:sz w:val="22"/>
-        </w:rPr>
-        <w:t xml:space="preserve">   주 소:                                                              </w:t>
-      </w:r>
-    </w:p>
-    <w:p/>
-    <w:p>
-      <w:r>
-        <w:rPr>
-          <w:b/>
-          <w:sz w:val="24"/>
-        </w:rPr>
-        <w:t>매수인 (을)</w:t>
-      </w:r>
-    </w:p>
-    <w:p>
-      <w:r>
-        <w:rPr>
-          <w:sz w:val="24"/>
-        </w:rPr>
-        <w:t xml:space="preserve">   성 명:                                        (인)</w:t>
-      </w:r>
-    </w:p>
-    <w:p>
-      <w:r>
-        <w:rPr>
-          <w:sz w:val="22"/>
-        </w:rPr>
-        <w:t xml:space="preserve">   주 소:                                                              </w:t>
-      </w:r>
-    </w:p>
-    <w:p/>
+    <w:tbl>
+      <w:tblPr>
+        <w:tblStyle w:val="TableGrid"/>
+        <w:tblW w:type="auto" w:w="0"/>
+        <w:jc w:val="center"/>
+        <w:tblLook w:firstColumn="1" w:firstRow="1" w:lastColumn="0" w:lastRow="0" w:noHBand="0" w:noVBand="1" w:val="04A0"/>
+      </w:tblPr>
+      <w:tblGrid>
+        <w:gridCol w:w="2351"/>
+        <w:gridCol w:w="2351"/>
+        <w:gridCol w:w="2351"/>
+        <w:gridCol w:w="2351"/>
+      </w:tblGrid>
+      <w:tr>
+        <w:tc>
+          <w:tcPr>
+            <w:tcW w:type="dxa" w:w="2351"/>
+            <w:vAlign w:val="center"/>
+            <w:shd w:fill="E8EAF6"/>
+          </w:tcPr>
+          <w:p>
+            <w:pPr>
+              <w:jc w:val="center"/>
+            </w:pPr>
+            <w:r/>
+            <w:r>
+              <w:rPr>
+                <w:rFonts w:eastAsia="Malgun Gothic" w:ascii="Malgun Gothic" w:hAnsi="Malgun Gothic"/>
+                <w:b/>
+                <w:sz w:val="20"/>
+              </w:rPr>
+              <w:t>구 분</w:t>
+            </w:r>
+          </w:p>
+        </w:tc>
+        <w:tc>
+          <w:tcPr>
+            <w:tcW w:type="dxa" w:w="2351"/>
+            <w:vAlign w:val="center"/>
+            <w:shd w:fill="E8EAF6"/>
+          </w:tcPr>
+          <w:p>
+            <w:pPr>
+              <w:jc w:val="center"/>
+            </w:pPr>
+            <w:r/>
+            <w:r>
+              <w:rPr>
+                <w:rFonts w:eastAsia="Malgun Gothic" w:ascii="Malgun Gothic" w:hAnsi="Malgun Gothic"/>
+                <w:b/>
+                <w:sz w:val="20"/>
+              </w:rPr>
+              <w:t>성 명</w:t>
+            </w:r>
+          </w:p>
+        </w:tc>
+        <w:tc>
+          <w:tcPr>
+            <w:tcW w:type="dxa" w:w="2351"/>
+            <w:vAlign w:val="center"/>
+            <w:shd w:fill="E8EAF6"/>
+          </w:tcPr>
+          <w:p>
+            <w:pPr>
+              <w:jc w:val="center"/>
+            </w:pPr>
+            <w:r/>
+            <w:r>
+              <w:rPr>
+                <w:rFonts w:eastAsia="Malgun Gothic" w:ascii="Malgun Gothic" w:hAnsi="Malgun Gothic"/>
+                <w:b/>
+                <w:sz w:val="20"/>
+              </w:rPr>
+              <w:t>주 소</w:t>
+            </w:r>
+          </w:p>
+        </w:tc>
+        <w:tc>
+          <w:tcPr>
+            <w:tcW w:type="dxa" w:w="2351"/>
+            <w:vAlign w:val="center"/>
+            <w:shd w:fill="E8EAF6"/>
+          </w:tcPr>
+          <w:p>
+            <w:pPr>
+              <w:jc w:val="center"/>
+            </w:pPr>
+            <w:r/>
+            <w:r>
+              <w:rPr>
+                <w:rFonts w:eastAsia="Malgun Gothic" w:ascii="Malgun Gothic" w:hAnsi="Malgun Gothic"/>
+                <w:b/>
+                <w:sz w:val="20"/>
+              </w:rPr>
+              <w:t>서명(인)</w:t>
+            </w:r>
+          </w:p>
+        </w:tc>
+      </w:tr>
+      <w:tr>
+        <w:tc>
+          <w:tcPr>
+            <w:tcW w:type="dxa" w:w="2351"/>
+            <w:vAlign w:val="center"/>
+          </w:tcPr>
+          <w:p>
+            <w:pPr>
+              <w:jc w:val="center"/>
+            </w:pPr>
+            <w:r/>
+            <w:r>
+              <w:rPr>
+                <w:rFonts w:eastAsia="Malgun Gothic" w:ascii="Malgun Gothic" w:hAnsi="Malgun Gothic"/>
+                <w:sz w:val="18"/>
+              </w:rPr>
+              <w:t>매도인 (갑)</w:t>
+            </w:r>
+          </w:p>
+        </w:tc>
+        <w:tc>
+          <w:tcPr>
+            <w:tcW w:type="dxa" w:w="2351"/>
+            <w:vAlign w:val="center"/>
+          </w:tcPr>
+          <w:p>
+            <w:pPr>
+              <w:jc w:val="center"/>
+            </w:pPr>
+            <w:r/>
+            <w:r>
+              <w:rPr>
+                <w:rFonts w:eastAsia="Malgun Gothic" w:ascii="Malgun Gothic" w:hAnsi="Malgun Gothic"/>
+                <w:sz w:val="18"/>
+              </w:rPr>
+            </w:r>
+          </w:p>
+        </w:tc>
+        <w:tc>
+          <w:tcPr>
+            <w:tcW w:type="dxa" w:w="2351"/>
+            <w:vAlign w:val="center"/>
+          </w:tcPr>
+          <w:p>
+            <w:pPr>
+              <w:jc w:val="center"/>
+            </w:pPr>
+            <w:r/>
+            <w:r>
+              <w:rPr>
+                <w:rFonts w:eastAsia="Malgun Gothic" w:ascii="Malgun Gothic" w:hAnsi="Malgun Gothic"/>
+                <w:sz w:val="18"/>
+              </w:rPr>
+            </w:r>
+          </w:p>
+        </w:tc>
+        <w:tc>
+          <w:tcPr>
+            <w:tcW w:type="dxa" w:w="2351"/>
+            <w:vAlign w:val="center"/>
+          </w:tcPr>
+          <w:p>
+            <w:pPr>
+              <w:jc w:val="center"/>
+            </w:pPr>
+            <w:r/>
+            <w:r>
+              <w:rPr>
+                <w:rFonts w:eastAsia="Malgun Gothic" w:ascii="Malgun Gothic" w:hAnsi="Malgun Gothic"/>
+                <w:sz w:val="18"/>
+              </w:rPr>
+              <w:t>(인)</w:t>
+            </w:r>
+          </w:p>
+        </w:tc>
+      </w:tr>
+      <w:tr>
+        <w:tc>
+          <w:tcPr>
+            <w:tcW w:type="dxa" w:w="2351"/>
+            <w:vAlign w:val="center"/>
+          </w:tcPr>
+          <w:p>
+            <w:pPr>
+              <w:jc w:val="center"/>
+            </w:pPr>
+            <w:r/>
+            <w:r>
+              <w:rPr>
+                <w:rFonts w:eastAsia="Malgun Gothic" w:ascii="Malgun Gothic" w:hAnsi="Malgun Gothic"/>
+                <w:sz w:val="18"/>
+              </w:rPr>
+            </w:r>
+          </w:p>
+        </w:tc>
+        <w:tc>
+          <w:tcPr>
+            <w:tcW w:type="dxa" w:w="2351"/>
+            <w:vAlign w:val="center"/>
+          </w:tcPr>
+          <w:p>
+            <w:pPr>
+              <w:jc w:val="center"/>
+            </w:pPr>
+            <w:r/>
+            <w:r>
+              <w:rPr>
+                <w:rFonts w:eastAsia="Malgun Gothic" w:ascii="Malgun Gothic" w:hAnsi="Malgun Gothic"/>
+                <w:sz w:val="18"/>
+              </w:rPr>
+            </w:r>
+          </w:p>
+        </w:tc>
+        <w:tc>
+          <w:tcPr>
+            <w:tcW w:type="dxa" w:w="2351"/>
+            <w:vAlign w:val="center"/>
+          </w:tcPr>
+          <w:p>
+            <w:pPr>
+              <w:jc w:val="center"/>
+            </w:pPr>
+            <w:r/>
+            <w:r>
+              <w:rPr>
+                <w:rFonts w:eastAsia="Malgun Gothic" w:ascii="Malgun Gothic" w:hAnsi="Malgun Gothic"/>
+                <w:sz w:val="18"/>
+              </w:rPr>
+            </w:r>
+          </w:p>
+        </w:tc>
+        <w:tc>
+          <w:tcPr>
+            <w:tcW w:type="dxa" w:w="2351"/>
+            <w:vAlign w:val="center"/>
+          </w:tcPr>
+          <w:p>
+            <w:pPr>
+              <w:jc w:val="center"/>
+            </w:pPr>
+            <w:r/>
+            <w:r>
+              <w:rPr>
+                <w:rFonts w:eastAsia="Malgun Gothic" w:ascii="Malgun Gothic" w:hAnsi="Malgun Gothic"/>
+                <w:sz w:val="18"/>
+              </w:rPr>
+            </w:r>
+          </w:p>
+        </w:tc>
+      </w:tr>
+      <w:tr>
+        <w:tc>
+          <w:tcPr>
+            <w:tcW w:type="dxa" w:w="2351"/>
+            <w:vAlign w:val="center"/>
+          </w:tcPr>
+          <w:p>
+            <w:pPr>
+              <w:jc w:val="center"/>
+            </w:pPr>
+            <w:r/>
+            <w:r>
+              <w:rPr>
+                <w:rFonts w:eastAsia="Malgun Gothic" w:ascii="Malgun Gothic" w:hAnsi="Malgun Gothic"/>
+                <w:sz w:val="18"/>
+              </w:rPr>
+              <w:t>매수인 (을)</w:t>
+            </w:r>
+          </w:p>
+        </w:tc>
+        <w:tc>
+          <w:tcPr>
+            <w:tcW w:type="dxa" w:w="2351"/>
+            <w:vAlign w:val="center"/>
+          </w:tcPr>
+          <w:p>
+            <w:pPr>
+              <w:jc w:val="center"/>
+            </w:pPr>
+            <w:r/>
+            <w:r>
+              <w:rPr>
+                <w:rFonts w:eastAsia="Malgun Gothic" w:ascii="Malgun Gothic" w:hAnsi="Malgun Gothic"/>
+                <w:sz w:val="18"/>
+              </w:rPr>
+            </w:r>
+          </w:p>
+        </w:tc>
+        <w:tc>
+          <w:tcPr>
+            <w:tcW w:type="dxa" w:w="2351"/>
+            <w:vAlign w:val="center"/>
+          </w:tcPr>
+          <w:p>
+            <w:pPr>
+              <w:jc w:val="center"/>
+            </w:pPr>
+            <w:r/>
+            <w:r>
+              <w:rPr>
+                <w:rFonts w:eastAsia="Malgun Gothic" w:ascii="Malgun Gothic" w:hAnsi="Malgun Gothic"/>
+                <w:sz w:val="18"/>
+              </w:rPr>
+            </w:r>
+          </w:p>
+        </w:tc>
+        <w:tc>
+          <w:tcPr>
+            <w:tcW w:type="dxa" w:w="2351"/>
+            <w:vAlign w:val="center"/>
+          </w:tcPr>
+          <w:p>
+            <w:pPr>
+              <w:jc w:val="center"/>
+            </w:pPr>
+            <w:r/>
+            <w:r>
+              <w:rPr>
+                <w:rFonts w:eastAsia="Malgun Gothic" w:ascii="Malgun Gothic" w:hAnsi="Malgun Gothic"/>
+                <w:sz w:val="18"/>
+              </w:rPr>
+              <w:t>(인)</w:t>
+            </w:r>
+          </w:p>
+        </w:tc>
+      </w:tr>
+      <w:tr>
+        <w:tc>
+          <w:tcPr>
+            <w:tcW w:type="dxa" w:w="2351"/>
+            <w:vAlign w:val="center"/>
+          </w:tcPr>
+          <w:p>
+            <w:pPr>
+              <w:jc w:val="center"/>
+            </w:pPr>
+            <w:r/>
+            <w:r>
+              <w:rPr>
+                <w:rFonts w:eastAsia="Malgun Gothic" w:ascii="Malgun Gothic" w:hAnsi="Malgun Gothic"/>
+                <w:sz w:val="18"/>
+              </w:rPr>
+            </w:r>
+          </w:p>
+        </w:tc>
+        <w:tc>
+          <w:tcPr>
+            <w:tcW w:type="dxa" w:w="2351"/>
+            <w:vAlign w:val="center"/>
+          </w:tcPr>
+          <w:p>
+            <w:pPr>
+              <w:jc w:val="center"/>
+            </w:pPr>
+            <w:r/>
+            <w:r>
+              <w:rPr>
+                <w:rFonts w:eastAsia="Malgun Gothic" w:ascii="Malgun Gothic" w:hAnsi="Malgun Gothic"/>
+                <w:sz w:val="18"/>
+              </w:rPr>
+            </w:r>
+          </w:p>
+        </w:tc>
+        <w:tc>
+          <w:tcPr>
+            <w:tcW w:type="dxa" w:w="2351"/>
+            <w:vAlign w:val="center"/>
+          </w:tcPr>
+          <w:p>
+            <w:pPr>
+              <w:jc w:val="center"/>
+            </w:pPr>
+            <w:r/>
+            <w:r>
+              <w:rPr>
+                <w:rFonts w:eastAsia="Malgun Gothic" w:ascii="Malgun Gothic" w:hAnsi="Malgun Gothic"/>
+                <w:sz w:val="18"/>
+              </w:rPr>
+            </w:r>
+          </w:p>
+        </w:tc>
+        <w:tc>
+          <w:tcPr>
+            <w:tcW w:type="dxa" w:w="2351"/>
+            <w:vAlign w:val="center"/>
+          </w:tcPr>
+          <w:p>
+            <w:pPr>
+              <w:jc w:val="center"/>
+            </w:pPr>
+            <w:r/>
+            <w:r>
+              <w:rPr>
+                <w:rFonts w:eastAsia="Malgun Gothic" w:ascii="Malgun Gothic" w:hAnsi="Malgun Gothic"/>
+                <w:sz w:val="18"/>
+              </w:rPr>
+            </w:r>
+          </w:p>
+        </w:tc>
+      </w:tr>
+    </w:tbl>
     <w:sectPr>
       <w:pgSz w:w="12240" w:h="15840"/>
-      <w:pgMar w:top="1440" w:right="1800" w:bottom="1440" w:left="1800" w:header="720" w:footer="720" w:gutter="0"/>
+      <w:pgMar w:top="1417" w:right="1417" w:bottom="1417" w:left="1417" w:header="720" w:footer="720" w:gutter="0"/>
       <w:cols w:space="720"/>
       <w:docGrid w:linePitch="360"/>
     </w:sectPr>
@@ -1902,9 +2975,10 @@
     <w:qFormat/>
     <w:rsid w:val="00FC693F"/>
     <w:pPr>
-      <w:spacing w:line="432" w:lineRule="auto"/>
+      <w:spacing w:line="432" w:lineRule="auto" w:after="0"/>
     </w:pPr>
     <w:rPr>
+      <w:rFonts w:eastAsia="Malgun Gothic" w:ascii="Malgun Gothic" w:hAnsi="Malgun Gothic"/>
       <w:sz w:val="22"/>
     </w:rPr>
   </w:style>

</xml_diff>